<commit_message>
docs: finalize lab record with architecture diagram, screenshots, and links
</commit_message>
<xml_diff>
--- a/LAB RECORD-6.docx
+++ b/LAB RECORD-6.docx
@@ -104,23 +104,8 @@
             <w:vAlign w:val="center"/>
           </w:tcPr>
           <w:p>
-            <w:pPr>
-              <w:pStyle w:val="TableParagraph"/>
-              <w:spacing w:line="240" w:lineRule="auto"/>
-              <w:ind w:left="243"/>
-              <w:jc w:val="center"/>
-              <w:rPr>
-                <w:b/>
-                <w:sz w:val="28"/>
-              </w:rPr>
-            </w:pPr>
-            <w:r>
-              <w:rPr>
-                <w:b/>
-                <w:spacing w:val="-2"/>
-                <w:sz w:val="28"/>
-              </w:rPr>
-              <w:t>&lt;REG. NO&gt;</w:t>
+            <w:r>
+              <w:t>URK23CS1121</w:t>
             </w:r>
           </w:p>
         </w:tc>
@@ -135,23 +120,8 @@
             <w:vAlign w:val="center"/>
           </w:tcPr>
           <w:p>
-            <w:pPr>
-              <w:pStyle w:val="TableParagraph"/>
-              <w:spacing w:line="321" w:lineRule="exact"/>
-              <w:ind w:left="12"/>
-              <w:jc w:val="center"/>
-              <w:rPr>
-                <w:b/>
-                <w:sz w:val="28"/>
-              </w:rPr>
-            </w:pPr>
-            <w:r>
-              <w:rPr>
-                <w:b/>
-                <w:spacing w:val="-2"/>
-                <w:sz w:val="28"/>
-              </w:rPr>
-              <w:t>&lt;DATE&gt;</w:t>
+            <w:r>
+              <w:t>22.10.2026</w:t>
             </w:r>
           </w:p>
         </w:tc>
@@ -586,10 +556,9 @@
             <w:tcW w:w="5938" w:type="dxa"/>
           </w:tcPr>
           <w:p>
-            <w:pPr>
-              <w:pStyle w:val="Heading2"/>
-              <w:ind w:left="0"/>
-            </w:pPr>
+            <w:r>
+              <w:t>22 years</w:t>
+            </w:r>
           </w:p>
         </w:tc>
       </w:tr>
@@ -623,10 +592,9 @@
             <w:tcW w:w="5938" w:type="dxa"/>
           </w:tcPr>
           <w:p>
-            <w:pPr>
-              <w:pStyle w:val="Heading2"/>
-              <w:ind w:left="0"/>
-            </w:pPr>
+            <w:r>
+              <w:t>Female</w:t>
+            </w:r>
           </w:p>
         </w:tc>
       </w:tr>
@@ -660,10 +628,9 @@
             <w:tcW w:w="5938" w:type="dxa"/>
           </w:tcPr>
           <w:p>
-            <w:pPr>
-              <w:pStyle w:val="Heading2"/>
-              <w:ind w:left="0"/>
-            </w:pPr>
+            <w:r>
+              <w:t>Fever, cough, sore throat, chills, fatigue, body aches, shortness of breath, chest pain (Extracted: Cough, Fever, Sore throat, Chills, Fatigue)</w:t>
+            </w:r>
           </w:p>
         </w:tc>
       </w:tr>
@@ -687,10 +654,9 @@
             <w:tcW w:w="5938" w:type="dxa"/>
           </w:tcPr>
           <w:p>
-            <w:pPr>
-              <w:pStyle w:val="Heading2"/>
-              <w:ind w:left="0"/>
-            </w:pPr>
+            <w:r>
+              <w:t>2 days</w:t>
+            </w:r>
           </w:p>
         </w:tc>
       </w:tr>
@@ -714,10 +680,9 @@
             <w:tcW w:w="5938" w:type="dxa"/>
           </w:tcPr>
           <w:p>
-            <w:pPr>
-              <w:pStyle w:val="Heading2"/>
-              <w:ind w:left="0"/>
-            </w:pPr>
+            <w:r>
+              <w:t>Mild</w:t>
+            </w:r>
           </w:p>
         </w:tc>
       </w:tr>
@@ -741,10 +706,9 @@
             <w:tcW w:w="5938" w:type="dxa"/>
           </w:tcPr>
           <w:p>
-            <w:pPr>
-              <w:pStyle w:val="Heading2"/>
-              <w:ind w:left="0"/>
-            </w:pPr>
+            <w:r>
+              <w:t>No known relevant condition</w:t>
+            </w:r>
           </w:p>
         </w:tc>
       </w:tr>
@@ -768,10 +732,9 @@
             <w:tcW w:w="5938" w:type="dxa"/>
           </w:tcPr>
           <w:p>
-            <w:pPr>
-              <w:pStyle w:val="Heading2"/>
-              <w:ind w:left="0"/>
-            </w:pPr>
+            <w:r>
+              <w:t>None</w:t>
+            </w:r>
           </w:p>
         </w:tc>
       </w:tr>
@@ -795,10 +758,9 @@
             <w:tcW w:w="5938" w:type="dxa"/>
           </w:tcPr>
           <w:p>
-            <w:pPr>
-              <w:pStyle w:val="Heading2"/>
-              <w:ind w:left="0"/>
-            </w:pPr>
+            <w:r>
+              <w:t>None</w:t>
+            </w:r>
           </w:p>
         </w:tc>
       </w:tr>
@@ -822,10 +784,9 @@
             <w:tcW w:w="5938" w:type="dxa"/>
           </w:tcPr>
           <w:p>
-            <w:pPr>
-              <w:pStyle w:val="Heading2"/>
-              <w:ind w:left="0"/>
-            </w:pPr>
+            <w:r>
+              <w:t>Vital signs (temperature, respiration status) pending evaluation; No known adverse drug reactions.</w:t>
+            </w:r>
           </w:p>
         </w:tc>
       </w:tr>
@@ -906,15 +867,42 @@
       <w:pPr>
         <w:pStyle w:val="NormalWeb"/>
         <w:ind w:left="165"/>
-      </w:pPr>
-      <w:r>
-        <w:t>&lt;</w:t>
-      </w:r>
-      <w:r>
-        <w:t>Students should insert the architecture diagram.</w:t>
-      </w:r>
-      <w:r>
-        <w:t>&gt;</w:t>
+        <w:jc w:val="center"/>
+      </w:pPr>
+      <w:r/>
+      <w:r>
+        <w:drawing>
+          <wp:inline xmlns:a="http://schemas.openxmlformats.org/drawingml/2006/main" xmlns:pic="http://schemas.openxmlformats.org/drawingml/2006/picture">
+            <wp:extent cx="5303520" cy="4232102"/>
+            <wp:docPr id="1" name="Picture 1"/>
+            <wp:cNvGraphicFramePr>
+              <a:graphicFrameLocks noChangeAspect="1"/>
+            </wp:cNvGraphicFramePr>
+            <a:graphic>
+              <a:graphicData uri="http://schemas.openxmlformats.org/drawingml/2006/picture">
+                <pic:pic>
+                  <pic:nvPicPr>
+                    <pic:cNvPr id="0" name="Architecture Diagram.png"/>
+                    <pic:cNvPicPr/>
+                  </pic:nvPicPr>
+                  <pic:blipFill>
+                    <a:blip r:embed="rId11"/>
+                    <a:stretch>
+                      <a:fillRect/>
+                    </a:stretch>
+                  </pic:blipFill>
+                  <pic:spPr>
+                    <a:xfrm>
+                      <a:off x="0" y="0"/>
+                      <a:ext cx="5303520" cy="4232102"/>
+                    </a:xfrm>
+                    <a:prstGeom prst="rect"/>
+                  </pic:spPr>
+                </pic:pic>
+              </a:graphicData>
+            </a:graphic>
+          </wp:inline>
+        </w:drawing>
       </w:r>
     </w:p>
     <w:p>
@@ -1067,10 +1055,9 @@
             <w:tcW w:w="3849" w:type="dxa"/>
           </w:tcPr>
           <w:p>
-            <w:pPr>
-              <w:pStyle w:val="Heading1"/>
-              <w:ind w:left="0"/>
-            </w:pPr>
+            <w:r>
+              <w:t>Collects patient demographic information, medical history, and natural language symptom descriptions interactively and from benchmark datasets.</w:t>
+            </w:r>
           </w:p>
         </w:tc>
       </w:tr>
@@ -1109,10 +1096,9 @@
             <w:tcW w:w="3849" w:type="dxa"/>
           </w:tcPr>
           <w:p>
-            <w:pPr>
-              <w:pStyle w:val="Heading1"/>
-              <w:ind w:left="0"/>
-            </w:pPr>
+            <w:r>
+              <w:t>Encapsulates, validates, and serializes patient profile parameters into structured models for prompt construction and reporting.</w:t>
+            </w:r>
           </w:p>
         </w:tc>
       </w:tr>
@@ -1159,10 +1145,9 @@
             <w:tcW w:w="3849" w:type="dxa"/>
           </w:tcPr>
           <w:p>
-            <w:pPr>
-              <w:pStyle w:val="Heading1"/>
-              <w:ind w:left="0"/>
-            </w:pPr>
+            <w:r>
+              <w:t>Extracts discrete clinical symptoms from conversational natural language narratives using clinical NLP pattern matching and phrase normalization.</w:t>
+            </w:r>
           </w:p>
         </w:tc>
       </w:tr>
@@ -1209,10 +1194,9 @@
             <w:tcW w:w="3849" w:type="dxa"/>
           </w:tcPr>
           <w:p>
-            <w:pPr>
-              <w:pStyle w:val="Heading1"/>
-              <w:ind w:left="0"/>
-            </w:pPr>
+            <w:r>
+              <w:t>Analyzes patient profile and symptom context to detect missing critical clinical parameters (e.g., measured temperature, breathing difficulty, progression).</w:t>
+            </w:r>
           </w:p>
         </w:tc>
       </w:tr>
@@ -1259,10 +1243,9 @@
             <w:tcW w:w="3849" w:type="dxa"/>
           </w:tcPr>
           <w:p>
-            <w:pPr>
-              <w:pStyle w:val="Heading1"/>
-              <w:ind w:left="0"/>
-            </w:pPr>
+            <w:r>
+              <w:t>Constructs guardrailed system and user prompts for GPT-4/Ollama enforcing non-diagnostic boundaries, uncertainty communication, and structured output formatting.</w:t>
+            </w:r>
           </w:p>
         </w:tc>
       </w:tr>
@@ -1309,10 +1292,9 @@
             <w:tcW w:w="3849" w:type="dxa"/>
           </w:tcPr>
           <w:p>
-            <w:pPr>
-              <w:pStyle w:val="Heading1"/>
-              <w:ind w:left="0"/>
-            </w:pPr>
+            <w:r>
+              <w:t>Interfaces with the LLM engine (local Ollama Llama 3.2 or OpenAI GPT-4) to generate preliminary condition hypotheses with clinical reasoning.</w:t>
+            </w:r>
           </w:p>
         </w:tc>
       </w:tr>
@@ -1359,10 +1341,9 @@
             <w:tcW w:w="3849" w:type="dxa"/>
           </w:tcPr>
           <w:p>
-            <w:pPr>
-              <w:pStyle w:val="Heading1"/>
-              <w:ind w:left="0"/>
-            </w:pPr>
+            <w:r>
+              <w:t>Dynamically formulates 5 targeted clinical follow-up questions tailored to reported symptoms and detected missing context to resolve clinical ambiguity.</w:t>
+            </w:r>
           </w:p>
         </w:tc>
       </w:tr>
@@ -1409,10 +1390,9 @@
             <w:tcW w:w="3849" w:type="dxa"/>
           </w:tcPr>
           <w:p>
-            <w:pPr>
-              <w:pStyle w:val="Heading1"/>
-              <w:ind w:left="0"/>
-            </w:pPr>
+            <w:r>
+              <w:t>Performs red-flag screening (cardiovascular, respiratory, neurological), determines risk escalation levels (Low, Moderate, Urgent), and enforces the mandatory medical disclaimer.</w:t>
+            </w:r>
           </w:p>
         </w:tc>
       </w:tr>
@@ -1451,10 +1431,9 @@
             <w:tcW w:w="3849" w:type="dxa"/>
           </w:tcPr>
           <w:p>
-            <w:pPr>
-              <w:pStyle w:val="Heading1"/>
-              <w:ind w:left="0"/>
-            </w:pPr>
+            <w:r>
+              <w:t>Compiles the comprehensive 8-part structured clinical analysis report and persists it to outputs/medical_analysis.txt.</w:t>
+            </w:r>
           </w:p>
         </w:tc>
       </w:tr>
@@ -1493,10 +1472,9 @@
             <w:tcW w:w="3849" w:type="dxa"/>
           </w:tcPr>
           <w:p>
-            <w:pPr>
-              <w:pStyle w:val="Heading1"/>
-              <w:ind w:left="0"/>
-            </w:pPr>
+            <w:r>
+              <w:t>Orchestrates the entire multi-module workflow, providing both a 9-option interactive terminal CLI and a visual web application launcher.</w:t>
+            </w:r>
           </w:p>
         </w:tc>
       </w:tr>
@@ -1523,8 +1501,18 @@
         <w:spacing w:before="0" w:beforeAutospacing="0" w:after="0" w:afterAutospacing="0"/>
       </w:pPr>
       <w:r>
-        <w:t>&lt;GitHub Link&gt;</w:t>
-      </w:r>
+        <w:t xml:space="preserve">GitHub Repository: </w:t>
+      </w:r>
+      <w:hyperlink r:id="rId12">
+        <w:r>
+          <w:rPr>
+            <w:color w:val="0284C7"/>
+            <w:u w:val="single"/>
+            <w:b/>
+          </w:rPr>
+          <w:t>https://github.com/DeepakKrishnanSU/AI-Powered-Medical-Symptom-Assistant-using-GPT-4</w:t>
+        </w:r>
+      </w:hyperlink>
     </w:p>
     <w:p>
       <w:pPr>
@@ -1532,8 +1520,18 @@
         <w:spacing w:before="0" w:beforeAutospacing="0" w:after="0" w:afterAutospacing="0"/>
       </w:pPr>
       <w:r>
-        <w:t>&lt;LinkedIn Post Link&gt;</w:t>
-      </w:r>
+        <w:t xml:space="preserve">LinkedIn Post: </w:t>
+      </w:r>
+      <w:hyperlink r:id="rId13">
+        <w:r>
+          <w:rPr>
+            <w:color w:val="0284C7"/>
+            <w:u w:val="single"/>
+            <w:b/>
+          </w:rPr>
+          <w:t>https://lnkd.in/p/gmazMz7E</w:t>
+        </w:r>
+      </w:hyperlink>
     </w:p>
     <w:p/>
     <w:p>
@@ -1600,9 +1598,48 @@
       </w:pPr>
       <w:r>
         <w:rPr>
-          <w:lang w:val="en-IN" w:eastAsia="en-IN"/>
+          <w:b/>
         </w:rPr>
-        <w:t>Home Screen</w:t>
+        <w:t>Home Screen:</w:t>
+      </w:r>
+    </w:p>
+    <w:p>
+      <w:pPr>
+        <w:jc w:val="center"/>
+      </w:pPr>
+      <w:r>
+        <w:drawing>
+          <wp:inline xmlns:a="http://schemas.openxmlformats.org/drawingml/2006/main" xmlns:pic="http://schemas.openxmlformats.org/drawingml/2006/picture">
+            <wp:extent cx="5120640" cy="2715783"/>
+            <wp:docPr id="2" name="Picture 2"/>
+            <wp:cNvGraphicFramePr>
+              <a:graphicFrameLocks noChangeAspect="1"/>
+            </wp:cNvGraphicFramePr>
+            <a:graphic>
+              <a:graphicData uri="http://schemas.openxmlformats.org/drawingml/2006/picture">
+                <pic:pic>
+                  <pic:nvPicPr>
+                    <pic:cNvPr id="0" name="Home Screen.png"/>
+                    <pic:cNvPicPr/>
+                  </pic:nvPicPr>
+                  <pic:blipFill>
+                    <a:blip r:embed="rId14"/>
+                    <a:stretch>
+                      <a:fillRect/>
+                    </a:stretch>
+                  </pic:blipFill>
+                  <pic:spPr>
+                    <a:xfrm>
+                      <a:off x="0" y="0"/>
+                      <a:ext cx="5120640" cy="2715783"/>
+                    </a:xfrm>
+                    <a:prstGeom prst="rect"/>
+                  </pic:spPr>
+                </pic:pic>
+              </a:graphicData>
+            </a:graphic>
+          </wp:inline>
+        </w:drawing>
       </w:r>
     </w:p>
     <w:p>
@@ -1618,9 +1655,48 @@
       </w:pPr>
       <w:r>
         <w:rPr>
-          <w:lang w:val="en-IN" w:eastAsia="en-IN"/>
+          <w:b/>
         </w:rPr>
-        <w:t>Patient Information Input</w:t>
+        <w:t>Patient Information Input:</w:t>
+      </w:r>
+    </w:p>
+    <w:p>
+      <w:pPr>
+        <w:jc w:val="center"/>
+      </w:pPr>
+      <w:r>
+        <w:drawing>
+          <wp:inline xmlns:a="http://schemas.openxmlformats.org/drawingml/2006/main" xmlns:pic="http://schemas.openxmlformats.org/drawingml/2006/picture">
+            <wp:extent cx="5120640" cy="2832398"/>
+            <wp:docPr id="3" name="Picture 3"/>
+            <wp:cNvGraphicFramePr>
+              <a:graphicFrameLocks noChangeAspect="1"/>
+            </wp:cNvGraphicFramePr>
+            <a:graphic>
+              <a:graphicData uri="http://schemas.openxmlformats.org/drawingml/2006/picture">
+                <pic:pic>
+                  <pic:nvPicPr>
+                    <pic:cNvPr id="0" name="Patient Input.png"/>
+                    <pic:cNvPicPr/>
+                  </pic:nvPicPr>
+                  <pic:blipFill>
+                    <a:blip r:embed="rId15"/>
+                    <a:stretch>
+                      <a:fillRect/>
+                    </a:stretch>
+                  </pic:blipFill>
+                  <pic:spPr>
+                    <a:xfrm>
+                      <a:off x="0" y="0"/>
+                      <a:ext cx="5120640" cy="2832398"/>
+                    </a:xfrm>
+                    <a:prstGeom prst="rect"/>
+                  </pic:spPr>
+                </pic:pic>
+              </a:graphicData>
+            </a:graphic>
+          </wp:inline>
+        </w:drawing>
       </w:r>
     </w:p>
     <w:p>
@@ -1636,9 +1712,48 @@
       </w:pPr>
       <w:r>
         <w:rPr>
-          <w:lang w:val="en-IN" w:eastAsia="en-IN"/>
+          <w:b/>
         </w:rPr>
-        <w:t>Symptom Input</w:t>
+        <w:t>Symptom Input:</w:t>
+      </w:r>
+    </w:p>
+    <w:p>
+      <w:pPr>
+        <w:jc w:val="center"/>
+      </w:pPr>
+      <w:r>
+        <w:drawing>
+          <wp:inline xmlns:a="http://schemas.openxmlformats.org/drawingml/2006/main" xmlns:pic="http://schemas.openxmlformats.org/drawingml/2006/picture">
+            <wp:extent cx="5120640" cy="5971716"/>
+            <wp:docPr id="4" name="Picture 4"/>
+            <wp:cNvGraphicFramePr>
+              <a:graphicFrameLocks noChangeAspect="1"/>
+            </wp:cNvGraphicFramePr>
+            <a:graphic>
+              <a:graphicData uri="http://schemas.openxmlformats.org/drawingml/2006/picture">
+                <pic:pic>
+                  <pic:nvPicPr>
+                    <pic:cNvPr id="0" name="Symptom Input.png"/>
+                    <pic:cNvPicPr/>
+                  </pic:nvPicPr>
+                  <pic:blipFill>
+                    <a:blip r:embed="rId16"/>
+                    <a:stretch>
+                      <a:fillRect/>
+                    </a:stretch>
+                  </pic:blipFill>
+                  <pic:spPr>
+                    <a:xfrm>
+                      <a:off x="0" y="0"/>
+                      <a:ext cx="5120640" cy="5971716"/>
+                    </a:xfrm>
+                    <a:prstGeom prst="rect"/>
+                  </pic:spPr>
+                </pic:pic>
+              </a:graphicData>
+            </a:graphic>
+          </wp:inline>
+        </w:drawing>
       </w:r>
     </w:p>
     <w:p>
@@ -1654,9 +1769,48 @@
       </w:pPr>
       <w:r>
         <w:rPr>
-          <w:lang w:val="en-IN" w:eastAsia="en-IN"/>
+          <w:b/>
         </w:rPr>
-        <w:t>Extracted Symptoms</w:t>
+        <w:t>Extracted Symptoms:</w:t>
+      </w:r>
+    </w:p>
+    <w:p>
+      <w:pPr>
+        <w:jc w:val="center"/>
+      </w:pPr>
+      <w:r>
+        <w:drawing>
+          <wp:inline xmlns:a="http://schemas.openxmlformats.org/drawingml/2006/main" xmlns:pic="http://schemas.openxmlformats.org/drawingml/2006/picture">
+            <wp:extent cx="5120640" cy="1019630"/>
+            <wp:docPr id="5" name="Picture 5"/>
+            <wp:cNvGraphicFramePr>
+              <a:graphicFrameLocks noChangeAspect="1"/>
+            </wp:cNvGraphicFramePr>
+            <a:graphic>
+              <a:graphicData uri="http://schemas.openxmlformats.org/drawingml/2006/picture">
+                <pic:pic>
+                  <pic:nvPicPr>
+                    <pic:cNvPr id="0" name="Extracted Symptoms.png"/>
+                    <pic:cNvPicPr/>
+                  </pic:nvPicPr>
+                  <pic:blipFill>
+                    <a:blip r:embed="rId17"/>
+                    <a:stretch>
+                      <a:fillRect/>
+                    </a:stretch>
+                  </pic:blipFill>
+                  <pic:spPr>
+                    <a:xfrm>
+                      <a:off x="0" y="0"/>
+                      <a:ext cx="5120640" cy="1019630"/>
+                    </a:xfrm>
+                    <a:prstGeom prst="rect"/>
+                  </pic:spPr>
+                </pic:pic>
+              </a:graphicData>
+            </a:graphic>
+          </wp:inline>
+        </w:drawing>
       </w:r>
     </w:p>
     <w:p>
@@ -1672,9 +1826,48 @@
       </w:pPr>
       <w:r>
         <w:rPr>
-          <w:lang w:val="en-IN" w:eastAsia="en-IN"/>
+          <w:b/>
         </w:rPr>
-        <w:t>Context Analysis</w:t>
+        <w:t>Context Analysis:</w:t>
+      </w:r>
+    </w:p>
+    <w:p>
+      <w:pPr>
+        <w:jc w:val="center"/>
+      </w:pPr>
+      <w:r>
+        <w:drawing>
+          <wp:inline xmlns:a="http://schemas.openxmlformats.org/drawingml/2006/main" xmlns:pic="http://schemas.openxmlformats.org/drawingml/2006/picture">
+            <wp:extent cx="5120640" cy="3207195"/>
+            <wp:docPr id="6" name="Picture 6"/>
+            <wp:cNvGraphicFramePr>
+              <a:graphicFrameLocks noChangeAspect="1"/>
+            </wp:cNvGraphicFramePr>
+            <a:graphic>
+              <a:graphicData uri="http://schemas.openxmlformats.org/drawingml/2006/picture">
+                <pic:pic>
+                  <pic:nvPicPr>
+                    <pic:cNvPr id="0" name="Context Analysis.png"/>
+                    <pic:cNvPicPr/>
+                  </pic:nvPicPr>
+                  <pic:blipFill>
+                    <a:blip r:embed="rId18"/>
+                    <a:stretch>
+                      <a:fillRect/>
+                    </a:stretch>
+                  </pic:blipFill>
+                  <pic:spPr>
+                    <a:xfrm>
+                      <a:off x="0" y="0"/>
+                      <a:ext cx="5120640" cy="3207195"/>
+                    </a:xfrm>
+                    <a:prstGeom prst="rect"/>
+                  </pic:spPr>
+                </pic:pic>
+              </a:graphicData>
+            </a:graphic>
+          </wp:inline>
+        </w:drawing>
       </w:r>
     </w:p>
     <w:p>
@@ -1690,9 +1883,48 @@
       </w:pPr>
       <w:r>
         <w:rPr>
-          <w:lang w:val="en-IN" w:eastAsia="en-IN"/>
+          <w:b/>
         </w:rPr>
-        <w:t>Prompt Generation</w:t>
+        <w:t>Prompt Generation:</w:t>
+      </w:r>
+    </w:p>
+    <w:p>
+      <w:pPr>
+        <w:jc w:val="center"/>
+      </w:pPr>
+      <w:r>
+        <w:drawing>
+          <wp:inline xmlns:a="http://schemas.openxmlformats.org/drawingml/2006/main" xmlns:pic="http://schemas.openxmlformats.org/drawingml/2006/picture">
+            <wp:extent cx="5120640" cy="376980"/>
+            <wp:docPr id="7" name="Picture 7"/>
+            <wp:cNvGraphicFramePr>
+              <a:graphicFrameLocks noChangeAspect="1"/>
+            </wp:cNvGraphicFramePr>
+            <a:graphic>
+              <a:graphicData uri="http://schemas.openxmlformats.org/drawingml/2006/picture">
+                <pic:pic>
+                  <pic:nvPicPr>
+                    <pic:cNvPr id="0" name="Prompt Generation.png"/>
+                    <pic:cNvPicPr/>
+                  </pic:nvPicPr>
+                  <pic:blipFill>
+                    <a:blip r:embed="rId19"/>
+                    <a:stretch>
+                      <a:fillRect/>
+                    </a:stretch>
+                  </pic:blipFill>
+                  <pic:spPr>
+                    <a:xfrm>
+                      <a:off x="0" y="0"/>
+                      <a:ext cx="5120640" cy="376980"/>
+                    </a:xfrm>
+                    <a:prstGeom prst="rect"/>
+                  </pic:spPr>
+                </pic:pic>
+              </a:graphicData>
+            </a:graphic>
+          </wp:inline>
+        </w:drawing>
       </w:r>
     </w:p>
     <w:p>
@@ -1708,9 +1940,48 @@
       </w:pPr>
       <w:r>
         <w:rPr>
-          <w:lang w:val="en-IN" w:eastAsia="en-IN"/>
+          <w:b/>
         </w:rPr>
-        <w:t>GPT-4 Response</w:t>
+        <w:t>GPT-4 Response:</w:t>
+      </w:r>
+    </w:p>
+    <w:p>
+      <w:pPr>
+        <w:jc w:val="center"/>
+      </w:pPr>
+      <w:r>
+        <w:drawing>
+          <wp:inline xmlns:a="http://schemas.openxmlformats.org/drawingml/2006/main" xmlns:pic="http://schemas.openxmlformats.org/drawingml/2006/picture">
+            <wp:extent cx="5120640" cy="3851329"/>
+            <wp:docPr id="8" name="Picture 8"/>
+            <wp:cNvGraphicFramePr>
+              <a:graphicFrameLocks noChangeAspect="1"/>
+            </wp:cNvGraphicFramePr>
+            <a:graphic>
+              <a:graphicData uri="http://schemas.openxmlformats.org/drawingml/2006/picture">
+                <pic:pic>
+                  <pic:nvPicPr>
+                    <pic:cNvPr id="0" name="GPT-4 Response.png"/>
+                    <pic:cNvPicPr/>
+                  </pic:nvPicPr>
+                  <pic:blipFill>
+                    <a:blip r:embed="rId20"/>
+                    <a:stretch>
+                      <a:fillRect/>
+                    </a:stretch>
+                  </pic:blipFill>
+                  <pic:spPr>
+                    <a:xfrm>
+                      <a:off x="0" y="0"/>
+                      <a:ext cx="5120640" cy="3851329"/>
+                    </a:xfrm>
+                    <a:prstGeom prst="rect"/>
+                  </pic:spPr>
+                </pic:pic>
+              </a:graphicData>
+            </a:graphic>
+          </wp:inline>
+        </w:drawing>
       </w:r>
     </w:p>
     <w:p>
@@ -1726,9 +1997,48 @@
       </w:pPr>
       <w:r>
         <w:rPr>
-          <w:lang w:val="en-IN" w:eastAsia="en-IN"/>
+          <w:b/>
         </w:rPr>
-        <w:t>Possible Conditions</w:t>
+        <w:t>Possible Conditions:</w:t>
+      </w:r>
+    </w:p>
+    <w:p>
+      <w:pPr>
+        <w:jc w:val="center"/>
+      </w:pPr>
+      <w:r>
+        <w:drawing>
+          <wp:inline xmlns:a="http://schemas.openxmlformats.org/drawingml/2006/main" xmlns:pic="http://schemas.openxmlformats.org/drawingml/2006/picture">
+            <wp:extent cx="5120640" cy="3851329"/>
+            <wp:docPr id="9" name="Picture 9"/>
+            <wp:cNvGraphicFramePr>
+              <a:graphicFrameLocks noChangeAspect="1"/>
+            </wp:cNvGraphicFramePr>
+            <a:graphic>
+              <a:graphicData uri="http://schemas.openxmlformats.org/drawingml/2006/picture">
+                <pic:pic>
+                  <pic:nvPicPr>
+                    <pic:cNvPr id="0" name="GPT-4 Response.png"/>
+                    <pic:cNvPicPr/>
+                  </pic:nvPicPr>
+                  <pic:blipFill>
+                    <a:blip r:embed="rId20"/>
+                    <a:stretch>
+                      <a:fillRect/>
+                    </a:stretch>
+                  </pic:blipFill>
+                  <pic:spPr>
+                    <a:xfrm>
+                      <a:off x="0" y="0"/>
+                      <a:ext cx="5120640" cy="3851329"/>
+                    </a:xfrm>
+                    <a:prstGeom prst="rect"/>
+                  </pic:spPr>
+                </pic:pic>
+              </a:graphicData>
+            </a:graphic>
+          </wp:inline>
+        </w:drawing>
       </w:r>
     </w:p>
     <w:p>
@@ -1744,9 +2054,48 @@
       </w:pPr>
       <w:r>
         <w:rPr>
-          <w:lang w:val="en-IN" w:eastAsia="en-IN"/>
+          <w:b/>
         </w:rPr>
-        <w:t>Follow-up Questions</w:t>
+        <w:t>Follow-up Questions:</w:t>
+      </w:r>
+    </w:p>
+    <w:p>
+      <w:pPr>
+        <w:jc w:val="center"/>
+      </w:pPr>
+      <w:r>
+        <w:drawing>
+          <wp:inline xmlns:a="http://schemas.openxmlformats.org/drawingml/2006/main" xmlns:pic="http://schemas.openxmlformats.org/drawingml/2006/picture">
+            <wp:extent cx="5120640" cy="3888687"/>
+            <wp:docPr id="10" name="Picture 10"/>
+            <wp:cNvGraphicFramePr>
+              <a:graphicFrameLocks noChangeAspect="1"/>
+            </wp:cNvGraphicFramePr>
+            <a:graphic>
+              <a:graphicData uri="http://schemas.openxmlformats.org/drawingml/2006/picture">
+                <pic:pic>
+                  <pic:nvPicPr>
+                    <pic:cNvPr id="0" name="Follow-up Questions.png"/>
+                    <pic:cNvPicPr/>
+                  </pic:nvPicPr>
+                  <pic:blipFill>
+                    <a:blip r:embed="rId21"/>
+                    <a:stretch>
+                      <a:fillRect/>
+                    </a:stretch>
+                  </pic:blipFill>
+                  <pic:spPr>
+                    <a:xfrm>
+                      <a:off x="0" y="0"/>
+                      <a:ext cx="5120640" cy="3888687"/>
+                    </a:xfrm>
+                    <a:prstGeom prst="rect"/>
+                  </pic:spPr>
+                </pic:pic>
+              </a:graphicData>
+            </a:graphic>
+          </wp:inline>
+        </w:drawing>
       </w:r>
     </w:p>
     <w:p>
@@ -1762,9 +2111,48 @@
       </w:pPr>
       <w:r>
         <w:rPr>
-          <w:lang w:val="en-IN" w:eastAsia="en-IN"/>
+          <w:b/>
         </w:rPr>
-        <w:t>Medical Attention Guidance</w:t>
+        <w:t>Medical Attention Guidance:</w:t>
+      </w:r>
+    </w:p>
+    <w:p>
+      <w:pPr>
+        <w:jc w:val="center"/>
+      </w:pPr>
+      <w:r>
+        <w:drawing>
+          <wp:inline xmlns:a="http://schemas.openxmlformats.org/drawingml/2006/main" xmlns:pic="http://schemas.openxmlformats.org/drawingml/2006/picture">
+            <wp:extent cx="5120640" cy="1360505"/>
+            <wp:docPr id="11" name="Picture 11"/>
+            <wp:cNvGraphicFramePr>
+              <a:graphicFrameLocks noChangeAspect="1"/>
+            </wp:cNvGraphicFramePr>
+            <a:graphic>
+              <a:graphicData uri="http://schemas.openxmlformats.org/drawingml/2006/picture">
+                <pic:pic>
+                  <pic:nvPicPr>
+                    <pic:cNvPr id="0" name="Triage Guidance.png"/>
+                    <pic:cNvPicPr/>
+                  </pic:nvPicPr>
+                  <pic:blipFill>
+                    <a:blip r:embed="rId22"/>
+                    <a:stretch>
+                      <a:fillRect/>
+                    </a:stretch>
+                  </pic:blipFill>
+                  <pic:spPr>
+                    <a:xfrm>
+                      <a:off x="0" y="0"/>
+                      <a:ext cx="5120640" cy="1360505"/>
+                    </a:xfrm>
+                    <a:prstGeom prst="rect"/>
+                  </pic:spPr>
+                </pic:pic>
+              </a:graphicData>
+            </a:graphic>
+          </wp:inline>
+        </w:drawing>
       </w:r>
     </w:p>
     <w:p>
@@ -1780,9 +2168,48 @@
       </w:pPr>
       <w:r>
         <w:rPr>
-          <w:lang w:val="en-IN" w:eastAsia="en-IN"/>
+          <w:b/>
         </w:rPr>
-        <w:t>Complete Structured Analysis</w:t>
+        <w:t>Complete Structured Analysis:</w:t>
+      </w:r>
+    </w:p>
+    <w:p>
+      <w:pPr>
+        <w:jc w:val="center"/>
+      </w:pPr>
+      <w:r>
+        <w:drawing>
+          <wp:inline xmlns:a="http://schemas.openxmlformats.org/drawingml/2006/main" xmlns:pic="http://schemas.openxmlformats.org/drawingml/2006/picture">
+            <wp:extent cx="5120640" cy="2529126"/>
+            <wp:docPr id="12" name="Picture 12"/>
+            <wp:cNvGraphicFramePr>
+              <a:graphicFrameLocks noChangeAspect="1"/>
+            </wp:cNvGraphicFramePr>
+            <a:graphic>
+              <a:graphicData uri="http://schemas.openxmlformats.org/drawingml/2006/picture">
+                <pic:pic>
+                  <pic:nvPicPr>
+                    <pic:cNvPr id="0" name="Structured Report.png"/>
+                    <pic:cNvPicPr/>
+                  </pic:nvPicPr>
+                  <pic:blipFill>
+                    <a:blip r:embed="rId23"/>
+                    <a:stretch>
+                      <a:fillRect/>
+                    </a:stretch>
+                  </pic:blipFill>
+                  <pic:spPr>
+                    <a:xfrm>
+                      <a:off x="0" y="0"/>
+                      <a:ext cx="5120640" cy="2529126"/>
+                    </a:xfrm>
+                    <a:prstGeom prst="rect"/>
+                  </pic:spPr>
+                </pic:pic>
+              </a:graphicData>
+            </a:graphic>
+          </wp:inline>
+        </w:drawing>
       </w:r>
     </w:p>
     <w:p>
@@ -1798,9 +2225,48 @@
       </w:pPr>
       <w:r>
         <w:rPr>
-          <w:lang w:val="en-IN" w:eastAsia="en-IN"/>
+          <w:b/>
         </w:rPr>
-        <w:t>Disclaimer</w:t>
+        <w:t>Disclaimer:</w:t>
+      </w:r>
+    </w:p>
+    <w:p>
+      <w:pPr>
+        <w:jc w:val="center"/>
+      </w:pPr>
+      <w:r>
+        <w:drawing>
+          <wp:inline xmlns:a="http://schemas.openxmlformats.org/drawingml/2006/main" xmlns:pic="http://schemas.openxmlformats.org/drawingml/2006/picture">
+            <wp:extent cx="5120640" cy="1563143"/>
+            <wp:docPr id="13" name="Picture 13"/>
+            <wp:cNvGraphicFramePr>
+              <a:graphicFrameLocks noChangeAspect="1"/>
+            </wp:cNvGraphicFramePr>
+            <a:graphic>
+              <a:graphicData uri="http://schemas.openxmlformats.org/drawingml/2006/picture">
+                <pic:pic>
+                  <pic:nvPicPr>
+                    <pic:cNvPr id="0" name="Disclaimer.png"/>
+                    <pic:cNvPicPr/>
+                  </pic:nvPicPr>
+                  <pic:blipFill>
+                    <a:blip r:embed="rId24"/>
+                    <a:stretch>
+                      <a:fillRect/>
+                    </a:stretch>
+                  </pic:blipFill>
+                  <pic:spPr>
+                    <a:xfrm>
+                      <a:off x="0" y="0"/>
+                      <a:ext cx="5120640" cy="1563143"/>
+                    </a:xfrm>
+                    <a:prstGeom prst="rect"/>
+                  </pic:spPr>
+                </pic:pic>
+              </a:graphicData>
+            </a:graphic>
+          </wp:inline>
+        </w:drawing>
       </w:r>
     </w:p>
     <w:p>
@@ -1817,9 +2283,48 @@
       </w:pPr>
       <w:r>
         <w:rPr>
-          <w:lang w:val="en-IN" w:eastAsia="en-IN"/>
+          <w:b/>
         </w:rPr>
-        <w:t>Saved Report</w:t>
+        <w:t>Saved Report:</w:t>
+      </w:r>
+    </w:p>
+    <w:p>
+      <w:pPr>
+        <w:jc w:val="center"/>
+      </w:pPr>
+      <w:r>
+        <w:drawing>
+          <wp:inline xmlns:a="http://schemas.openxmlformats.org/drawingml/2006/main" xmlns:pic="http://schemas.openxmlformats.org/drawingml/2006/picture">
+            <wp:extent cx="5120640" cy="2560320"/>
+            <wp:docPr id="14" name="Picture 14"/>
+            <wp:cNvGraphicFramePr>
+              <a:graphicFrameLocks noChangeAspect="1"/>
+            </wp:cNvGraphicFramePr>
+            <a:graphic>
+              <a:graphicData uri="http://schemas.openxmlformats.org/drawingml/2006/picture">
+                <pic:pic>
+                  <pic:nvPicPr>
+                    <pic:cNvPr id="0" name="Saved Report.png"/>
+                    <pic:cNvPicPr/>
+                  </pic:nvPicPr>
+                  <pic:blipFill>
+                    <a:blip r:embed="rId25"/>
+                    <a:stretch>
+                      <a:fillRect/>
+                    </a:stretch>
+                  </pic:blipFill>
+                  <pic:spPr>
+                    <a:xfrm>
+                      <a:off x="0" y="0"/>
+                      <a:ext cx="5120640" cy="2560320"/>
+                    </a:xfrm>
+                    <a:prstGeom prst="rect"/>
+                  </pic:spPr>
+                </pic:pic>
+              </a:graphicData>
+            </a:graphic>
+          </wp:inline>
+        </w:drawing>
       </w:r>
     </w:p>
     <w:p>

</xml_diff>

<commit_message>
style: format date and regno in header to centered bold Times New Roman 14pt
</commit_message>
<xml_diff>
--- a/LAB RECORD-6.docx
+++ b/LAB RECORD-6.docx
@@ -1,6 +1,6 @@
 
 <file path=word/document.xml><?xml version="1.0" encoding="utf-8"?>
-<w:document xmlns:wpc="http://schemas.microsoft.com/office/word/2010/wordprocessingCanvas" xmlns:mc="http://schemas.openxmlformats.org/markup-compatibility/2006" xmlns:o="urn:schemas-microsoft-com:office:office" xmlns:r="http://schemas.openxmlformats.org/officeDocument/2006/relationships" xmlns:m="http://schemas.openxmlformats.org/officeDocument/2006/math" xmlns:v="urn:schemas-microsoft-com:vml" xmlns:wp14="http://schemas.microsoft.com/office/word/2010/wordprocessingDrawing" xmlns:wp="http://schemas.openxmlformats.org/drawingml/2006/wordprocessingDrawing" xmlns:w10="urn:schemas-microsoft-com:office:word" xmlns:w="http://schemas.openxmlformats.org/wordprocessingml/2006/main" xmlns:w14="http://schemas.microsoft.com/office/word/2010/wordml" xmlns:wpg="http://schemas.microsoft.com/office/word/2010/wordprocessingGroup" xmlns:wpi="http://schemas.microsoft.com/office/word/2010/wordprocessingInk" xmlns:wne="http://schemas.microsoft.com/office/word/2006/wordml" xmlns:wps="http://schemas.microsoft.com/office/word/2010/wordprocessingShape" mc:Ignorable="w14 wp14">
+<w:document xmlns:wpc="http://schemas.microsoft.com/office/word/2010/wordprocessingCanvas" xmlns:cx="http://schemas.microsoft.com/office/drawing/2014/chartex" xmlns:cx1="http://schemas.microsoft.com/office/drawing/2015/9/8/chartex" xmlns:cx2="http://schemas.microsoft.com/office/drawing/2015/10/21/chartex" xmlns:cx3="http://schemas.microsoft.com/office/drawing/2016/5/9/chartex" xmlns:cx4="http://schemas.microsoft.com/office/drawing/2016/5/10/chartex" xmlns:cx5="http://schemas.microsoft.com/office/drawing/2016/5/11/chartex" xmlns:cx6="http://schemas.microsoft.com/office/drawing/2016/5/12/chartex" xmlns:cx7="http://schemas.microsoft.com/office/drawing/2016/5/13/chartex" xmlns:cx8="http://schemas.microsoft.com/office/drawing/2016/5/14/chartex" xmlns:mc="http://schemas.openxmlformats.org/markup-compatibility/2006" xmlns:aink="http://schemas.microsoft.com/office/drawing/2016/ink" xmlns:am3d="http://schemas.microsoft.com/office/drawing/2017/model3d" xmlns:o="urn:schemas-microsoft-com:office:office" xmlns:oel="http://schemas.microsoft.com/office/2019/extlst" xmlns:r="http://schemas.openxmlformats.org/officeDocument/2006/relationships" xmlns:m="http://schemas.openxmlformats.org/officeDocument/2006/math" xmlns:v="urn:schemas-microsoft-com:vml" xmlns:wp14="http://schemas.microsoft.com/office/word/2010/wordprocessingDrawing" xmlns:wp="http://schemas.openxmlformats.org/drawingml/2006/wordprocessingDrawing" xmlns:w10="urn:schemas-microsoft-com:office:word" xmlns:w="http://schemas.openxmlformats.org/wordprocessingml/2006/main" xmlns:w14="http://schemas.microsoft.com/office/word/2010/wordml" xmlns:w15="http://schemas.microsoft.com/office/word/2012/wordml" xmlns:w16cex="http://schemas.microsoft.com/office/word/2018/wordml/cex" xmlns:w16cid="http://schemas.microsoft.com/office/word/2016/wordml/cid" xmlns:w16="http://schemas.microsoft.com/office/word/2018/wordml" xmlns:w16du="http://schemas.microsoft.com/office/word/2023/wordml/word16du" xmlns:w16sdtdh="http://schemas.microsoft.com/office/word/2020/wordml/sdtdatahash" xmlns:w16sdtfl="http://schemas.microsoft.com/office/word/2024/wordml/sdtformatlock" xmlns:w16se="http://schemas.microsoft.com/office/word/2015/wordml/symex" xmlns:wpg="http://schemas.microsoft.com/office/word/2010/wordprocessingGroup" xmlns:wpi="http://schemas.microsoft.com/office/word/2010/wordprocessingInk" xmlns:wne="http://schemas.microsoft.com/office/word/2006/wordml" xmlns:wps="http://schemas.microsoft.com/office/word/2010/wordprocessingShape" mc:Ignorable="w14 w15 w16se w16cid w16 w16cex w16sdtdh w16sdtfl w16du wp14">
   <w:body>
     <w:tbl>
       <w:tblPr>
@@ -104,7 +104,16 @@
             <w:vAlign w:val="center"/>
           </w:tcPr>
           <w:p>
-            <w:r>
+            <w:pPr>
+              <w:jc w:val="center"/>
+            </w:pPr>
+            <w:r/>
+            <w:r>
+              <w:rPr>
+                <w:rFonts w:ascii="Times New Roman" w:hAnsi="Times New Roman"/>
+                <w:b/>
+                <w:sz w:val="28"/>
+              </w:rPr>
               <w:t>URK23CS1121</w:t>
             </w:r>
           </w:p>
@@ -120,7 +129,16 @@
             <w:vAlign w:val="center"/>
           </w:tcPr>
           <w:p>
-            <w:r>
+            <w:pPr>
+              <w:jc w:val="center"/>
+            </w:pPr>
+            <w:r/>
+            <w:r>
+              <w:rPr>
+                <w:rFonts w:ascii="Times New Roman" w:hAnsi="Times New Roman"/>
+                <w:b/>
+                <w:sz w:val="28"/>
+              </w:rPr>
               <w:t>22.10.2026</w:t>
             </w:r>
           </w:p>
@@ -869,24 +887,28 @@
         <w:ind w:left="165"/>
         <w:jc w:val="center"/>
       </w:pPr>
-      <w:r/>
-      <w:r>
+      <w:r>
+        <w:rPr>
+          <w:noProof/>
+        </w:rPr>
+        <w:lastRenderedPageBreak/>
         <w:drawing>
-          <wp:inline xmlns:a="http://schemas.openxmlformats.org/drawingml/2006/main" xmlns:pic="http://schemas.openxmlformats.org/drawingml/2006/picture">
+          <wp:inline distT="0" distB="0" distL="0" distR="0" wp14:anchorId="4F136A7C" wp14:editId="4F136A7D">
             <wp:extent cx="5303520" cy="4232102"/>
+            <wp:effectExtent l="0" t="0" r="0" b="0"/>
             <wp:docPr id="1" name="Picture 1"/>
             <wp:cNvGraphicFramePr>
-              <a:graphicFrameLocks noChangeAspect="1"/>
+              <a:graphicFrameLocks xmlns:a="http://schemas.openxmlformats.org/drawingml/2006/main" noChangeAspect="1"/>
             </wp:cNvGraphicFramePr>
-            <a:graphic>
+            <a:graphic xmlns:a="http://schemas.openxmlformats.org/drawingml/2006/main">
               <a:graphicData uri="http://schemas.openxmlformats.org/drawingml/2006/picture">
-                <pic:pic>
+                <pic:pic xmlns:pic="http://schemas.openxmlformats.org/drawingml/2006/picture">
                   <pic:nvPicPr>
                     <pic:cNvPr id="0" name="Architecture Diagram.png"/>
                     <pic:cNvPicPr/>
                   </pic:nvPicPr>
                   <pic:blipFill>
-                    <a:blip r:embed="rId11"/>
+                    <a:blip r:embed="rId8"/>
                     <a:stretch>
                       <a:fillRect/>
                     </a:stretch>
@@ -896,7 +918,9 @@
                       <a:off x="0" y="0"/>
                       <a:ext cx="5303520" cy="4232102"/>
                     </a:xfrm>
-                    <a:prstGeom prst="rect"/>
+                    <a:prstGeom prst="rect">
+                      <a:avLst/>
+                    </a:prstGeom>
                   </pic:spPr>
                 </pic:pic>
               </a:graphicData>
@@ -929,7 +953,6 @@
         <w:rPr>
           <w:sz w:val="24"/>
         </w:rPr>
-        <w:lastRenderedPageBreak/>
         <w:t>Module Design</w:t>
       </w:r>
     </w:p>
@@ -1293,7 +1316,11 @@
           </w:tcPr>
           <w:p>
             <w:r>
-              <w:t>Interfaces with the LLM engine (local Ollama Llama 3.2 or OpenAI GPT-4) to generate preliminary condition hypotheses with clinical reasoning.</w:t>
+              <w:t xml:space="preserve">Interfaces with the LLM engine (local Ollama Llama 3.2 or OpenAI GPT-4) to </w:t>
+            </w:r>
+            <w:r>
+              <w:lastRenderedPageBreak/>
+              <w:t>generate preliminary condition hypotheses with clinical reasoning.</w:t>
             </w:r>
           </w:p>
         </w:tc>
@@ -1324,6 +1351,7 @@
                 <w:szCs w:val="24"/>
                 <w:lang w:val="en-IN" w:eastAsia="en-IN"/>
               </w:rPr>
+              <w:lastRenderedPageBreak/>
               <w:t>Question</w:t>
             </w:r>
             <w:r>
@@ -1503,12 +1531,12 @@
       <w:r>
         <w:t xml:space="preserve">GitHub Repository: </w:t>
       </w:r>
-      <w:hyperlink r:id="rId12">
+      <w:hyperlink r:id="rId9">
         <w:r>
           <w:rPr>
+            <w:b/>
             <w:color w:val="0284C7"/>
             <w:u w:val="single"/>
-            <w:b/>
           </w:rPr>
           <w:t>https://github.com/DeepakKrishnanSU/AI-Powered-Medical-Symptom-Assistant-using-GPT-4</w:t>
         </w:r>
@@ -1522,12 +1550,12 @@
       <w:r>
         <w:t xml:space="preserve">LinkedIn Post: </w:t>
       </w:r>
-      <w:hyperlink r:id="rId13">
+      <w:hyperlink r:id="rId10">
         <w:r>
           <w:rPr>
+            <w:b/>
             <w:color w:val="0284C7"/>
             <w:u w:val="single"/>
-            <w:b/>
           </w:rPr>
           <w:t>https://lnkd.in/p/gmazMz7E</w:t>
         </w:r>
@@ -1568,21 +1596,61 @@
     <w:p>
       <w:pPr>
         <w:pStyle w:val="Heading1"/>
-        <w:rPr>
-          <w:sz w:val="24"/>
-        </w:rPr>
-      </w:pPr>
-      <w:r>
-        <w:rPr>
-          <w:sz w:val="24"/>
-        </w:rPr>
-        <w:t xml:space="preserve">Include </w:t>
-      </w:r>
-      <w:r>
-        <w:rPr>
-          <w:sz w:val="24"/>
-        </w:rPr>
-        <w:t>screenshots for</w:t>
+        <w:numPr>
+          <w:ilvl w:val="0"/>
+          <w:numId w:val="13"/>
+        </w:numPr>
+        <w:rPr>
+          <w:lang w:val="en-IN" w:eastAsia="en-IN"/>
+        </w:rPr>
+      </w:pPr>
+      <w:r>
+        <w:t>Home Screen:</w:t>
+      </w:r>
+    </w:p>
+    <w:p>
+      <w:pPr>
+        <w:jc w:val="center"/>
+      </w:pPr>
+      <w:r>
+        <w:rPr>
+          <w:noProof/>
+        </w:rPr>
+        <w:drawing>
+          <wp:inline distT="0" distB="0" distL="0" distR="0" wp14:anchorId="4F136A7E" wp14:editId="4F136A7F">
+            <wp:extent cx="5120640" cy="2715783"/>
+            <wp:effectExtent l="0" t="0" r="0" b="0"/>
+            <wp:docPr id="2" name="Picture 2"/>
+            <wp:cNvGraphicFramePr>
+              <a:graphicFrameLocks xmlns:a="http://schemas.openxmlformats.org/drawingml/2006/main" noChangeAspect="1"/>
+            </wp:cNvGraphicFramePr>
+            <a:graphic xmlns:a="http://schemas.openxmlformats.org/drawingml/2006/main">
+              <a:graphicData uri="http://schemas.openxmlformats.org/drawingml/2006/picture">
+                <pic:pic xmlns:pic="http://schemas.openxmlformats.org/drawingml/2006/picture">
+                  <pic:nvPicPr>
+                    <pic:cNvPr id="0" name="Home Screen.png"/>
+                    <pic:cNvPicPr/>
+                  </pic:nvPicPr>
+                  <pic:blipFill>
+                    <a:blip r:embed="rId11"/>
+                    <a:stretch>
+                      <a:fillRect/>
+                    </a:stretch>
+                  </pic:blipFill>
+                  <pic:spPr>
+                    <a:xfrm>
+                      <a:off x="0" y="0"/>
+                      <a:ext cx="5120640" cy="2715783"/>
+                    </a:xfrm>
+                    <a:prstGeom prst="rect">
+                      <a:avLst/>
+                    </a:prstGeom>
+                  </pic:spPr>
+                </pic:pic>
+              </a:graphicData>
+            </a:graphic>
+          </wp:inline>
+        </w:drawing>
       </w:r>
     </w:p>
     <w:p>
@@ -1600,7 +1668,7 @@
         <w:rPr>
           <w:b/>
         </w:rPr>
-        <w:t>Home Screen:</w:t>
+        <w:t>Patient Information Input:</w:t>
       </w:r>
     </w:p>
     <w:p>
@@ -1608,18 +1676,150 @@
         <w:jc w:val="center"/>
       </w:pPr>
       <w:r>
+        <w:rPr>
+          <w:noProof/>
+        </w:rPr>
+        <w:lastRenderedPageBreak/>
         <w:drawing>
-          <wp:inline xmlns:a="http://schemas.openxmlformats.org/drawingml/2006/main" xmlns:pic="http://schemas.openxmlformats.org/drawingml/2006/picture">
-            <wp:extent cx="5120640" cy="2715783"/>
-            <wp:docPr id="2" name="Picture 2"/>
+          <wp:inline distT="0" distB="0" distL="0" distR="0" wp14:anchorId="4F136A80" wp14:editId="4F136A81">
+            <wp:extent cx="5120640" cy="2832398"/>
+            <wp:effectExtent l="0" t="0" r="0" b="0"/>
+            <wp:docPr id="3" name="Picture 3"/>
             <wp:cNvGraphicFramePr>
-              <a:graphicFrameLocks noChangeAspect="1"/>
+              <a:graphicFrameLocks xmlns:a="http://schemas.openxmlformats.org/drawingml/2006/main" noChangeAspect="1"/>
             </wp:cNvGraphicFramePr>
-            <a:graphic>
+            <a:graphic xmlns:a="http://schemas.openxmlformats.org/drawingml/2006/main">
               <a:graphicData uri="http://schemas.openxmlformats.org/drawingml/2006/picture">
-                <pic:pic>
+                <pic:pic xmlns:pic="http://schemas.openxmlformats.org/drawingml/2006/picture">
                   <pic:nvPicPr>
-                    <pic:cNvPr id="0" name="Home Screen.png"/>
+                    <pic:cNvPr id="0" name="Patient Input.png"/>
+                    <pic:cNvPicPr/>
+                  </pic:nvPicPr>
+                  <pic:blipFill>
+                    <a:blip r:embed="rId12"/>
+                    <a:stretch>
+                      <a:fillRect/>
+                    </a:stretch>
+                  </pic:blipFill>
+                  <pic:spPr>
+                    <a:xfrm>
+                      <a:off x="0" y="0"/>
+                      <a:ext cx="5120640" cy="2832398"/>
+                    </a:xfrm>
+                    <a:prstGeom prst="rect">
+                      <a:avLst/>
+                    </a:prstGeom>
+                  </pic:spPr>
+                </pic:pic>
+              </a:graphicData>
+            </a:graphic>
+          </wp:inline>
+        </w:drawing>
+      </w:r>
+    </w:p>
+    <w:p>
+      <w:pPr>
+        <w:pStyle w:val="BodyText"/>
+        <w:numPr>
+          <w:ilvl w:val="0"/>
+          <w:numId w:val="12"/>
+        </w:numPr>
+        <w:rPr>
+          <w:lang w:val="en-IN" w:eastAsia="en-IN"/>
+        </w:rPr>
+      </w:pPr>
+      <w:r>
+        <w:rPr>
+          <w:b/>
+        </w:rPr>
+        <w:t>Symptom Input:</w:t>
+      </w:r>
+    </w:p>
+    <w:p>
+      <w:pPr>
+        <w:jc w:val="center"/>
+      </w:pPr>
+      <w:r>
+        <w:rPr>
+          <w:noProof/>
+        </w:rPr>
+        <w:drawing>
+          <wp:inline distT="0" distB="0" distL="0" distR="0" wp14:anchorId="4F136A82" wp14:editId="4F136A83">
+            <wp:extent cx="5120640" cy="5971716"/>
+            <wp:effectExtent l="0" t="0" r="0" b="0"/>
+            <wp:docPr id="4" name="Picture 4"/>
+            <wp:cNvGraphicFramePr>
+              <a:graphicFrameLocks xmlns:a="http://schemas.openxmlformats.org/drawingml/2006/main" noChangeAspect="1"/>
+            </wp:cNvGraphicFramePr>
+            <a:graphic xmlns:a="http://schemas.openxmlformats.org/drawingml/2006/main">
+              <a:graphicData uri="http://schemas.openxmlformats.org/drawingml/2006/picture">
+                <pic:pic xmlns:pic="http://schemas.openxmlformats.org/drawingml/2006/picture">
+                  <pic:nvPicPr>
+                    <pic:cNvPr id="0" name="Symptom Input.png"/>
+                    <pic:cNvPicPr/>
+                  </pic:nvPicPr>
+                  <pic:blipFill>
+                    <a:blip r:embed="rId13"/>
+                    <a:stretch>
+                      <a:fillRect/>
+                    </a:stretch>
+                  </pic:blipFill>
+                  <pic:spPr>
+                    <a:xfrm>
+                      <a:off x="0" y="0"/>
+                      <a:ext cx="5120640" cy="5971716"/>
+                    </a:xfrm>
+                    <a:prstGeom prst="rect">
+                      <a:avLst/>
+                    </a:prstGeom>
+                  </pic:spPr>
+                </pic:pic>
+              </a:graphicData>
+            </a:graphic>
+          </wp:inline>
+        </w:drawing>
+      </w:r>
+    </w:p>
+    <w:p>
+      <w:pPr>
+        <w:pStyle w:val="BodyText"/>
+        <w:numPr>
+          <w:ilvl w:val="0"/>
+          <w:numId w:val="12"/>
+        </w:numPr>
+        <w:rPr>
+          <w:lang w:val="en-IN" w:eastAsia="en-IN"/>
+        </w:rPr>
+      </w:pPr>
+      <w:r>
+        <w:rPr>
+          <w:b/>
+        </w:rPr>
+        <w:t>Extracted Symptoms:</w:t>
+      </w:r>
+    </w:p>
+    <w:p>
+      <w:pPr>
+        <w:jc w:val="center"/>
+      </w:pPr>
+      <w:r>
+        <w:rPr>
+          <w:noProof/>
+        </w:rPr>
+        <w:lastRenderedPageBreak/>
+        <w:drawing>
+          <wp:inline distT="0" distB="0" distL="0" distR="0" wp14:anchorId="4F136A84" wp14:editId="4F136A85">
+            <wp:extent cx="5120640" cy="1019630"/>
+            <wp:effectExtent l="0" t="0" r="0" b="0"/>
+            <wp:docPr id="5" name="Picture 5"/>
+            <wp:cNvGraphicFramePr>
+              <a:graphicFrameLocks xmlns:a="http://schemas.openxmlformats.org/drawingml/2006/main" noChangeAspect="1"/>
+            </wp:cNvGraphicFramePr>
+            <a:graphic xmlns:a="http://schemas.openxmlformats.org/drawingml/2006/main">
+              <a:graphicData uri="http://schemas.openxmlformats.org/drawingml/2006/picture">
+                <pic:pic xmlns:pic="http://schemas.openxmlformats.org/drawingml/2006/picture">
+                  <pic:nvPicPr>
+                    <pic:cNvPr id="0" name="Extracted Symptoms.png"/>
                     <pic:cNvPicPr/>
                   </pic:nvPicPr>
                   <pic:blipFill>
@@ -1631,9 +1831,11 @@
                   <pic:spPr>
                     <a:xfrm>
                       <a:off x="0" y="0"/>
-                      <a:ext cx="5120640" cy="2715783"/>
+                      <a:ext cx="5120640" cy="1019630"/>
                     </a:xfrm>
-                    <a:prstGeom prst="rect"/>
+                    <a:prstGeom prst="rect">
+                      <a:avLst/>
+                    </a:prstGeom>
                   </pic:spPr>
                 </pic:pic>
               </a:graphicData>
@@ -1657,7 +1859,7 @@
         <w:rPr>
           <w:b/>
         </w:rPr>
-        <w:t>Patient Information Input:</w:t>
+        <w:t>Context Analysis:</w:t>
       </w:r>
     </w:p>
     <w:p>
@@ -1665,18 +1867,22 @@
         <w:jc w:val="center"/>
       </w:pPr>
       <w:r>
+        <w:rPr>
+          <w:noProof/>
+        </w:rPr>
         <w:drawing>
-          <wp:inline xmlns:a="http://schemas.openxmlformats.org/drawingml/2006/main" xmlns:pic="http://schemas.openxmlformats.org/drawingml/2006/picture">
-            <wp:extent cx="5120640" cy="2832398"/>
-            <wp:docPr id="3" name="Picture 3"/>
+          <wp:inline distT="0" distB="0" distL="0" distR="0" wp14:anchorId="4F136A86" wp14:editId="4F136A87">
+            <wp:extent cx="5120640" cy="3207195"/>
+            <wp:effectExtent l="0" t="0" r="0" b="0"/>
+            <wp:docPr id="6" name="Picture 6"/>
             <wp:cNvGraphicFramePr>
-              <a:graphicFrameLocks noChangeAspect="1"/>
+              <a:graphicFrameLocks xmlns:a="http://schemas.openxmlformats.org/drawingml/2006/main" noChangeAspect="1"/>
             </wp:cNvGraphicFramePr>
-            <a:graphic>
+            <a:graphic xmlns:a="http://schemas.openxmlformats.org/drawingml/2006/main">
               <a:graphicData uri="http://schemas.openxmlformats.org/drawingml/2006/picture">
-                <pic:pic>
+                <pic:pic xmlns:pic="http://schemas.openxmlformats.org/drawingml/2006/picture">
                   <pic:nvPicPr>
-                    <pic:cNvPr id="0" name="Patient Input.png"/>
+                    <pic:cNvPr id="0" name="Context Analysis.png"/>
                     <pic:cNvPicPr/>
                   </pic:nvPicPr>
                   <pic:blipFill>
@@ -1688,9 +1894,11 @@
                   <pic:spPr>
                     <a:xfrm>
                       <a:off x="0" y="0"/>
-                      <a:ext cx="5120640" cy="2832398"/>
+                      <a:ext cx="5120640" cy="3207195"/>
                     </a:xfrm>
-                    <a:prstGeom prst="rect"/>
+                    <a:prstGeom prst="rect">
+                      <a:avLst/>
+                    </a:prstGeom>
                   </pic:spPr>
                 </pic:pic>
               </a:graphicData>
@@ -1714,7 +1922,7 @@
         <w:rPr>
           <w:b/>
         </w:rPr>
-        <w:t>Symptom Input:</w:t>
+        <w:t>Prompt Generation:</w:t>
       </w:r>
     </w:p>
     <w:p>
@@ -1722,18 +1930,22 @@
         <w:jc w:val="center"/>
       </w:pPr>
       <w:r>
+        <w:rPr>
+          <w:noProof/>
+        </w:rPr>
         <w:drawing>
-          <wp:inline xmlns:a="http://schemas.openxmlformats.org/drawingml/2006/main" xmlns:pic="http://schemas.openxmlformats.org/drawingml/2006/picture">
-            <wp:extent cx="5120640" cy="5971716"/>
-            <wp:docPr id="4" name="Picture 4"/>
+          <wp:inline distT="0" distB="0" distL="0" distR="0" wp14:anchorId="4F136A88" wp14:editId="4F136A89">
+            <wp:extent cx="5120640" cy="376980"/>
+            <wp:effectExtent l="0" t="0" r="0" b="0"/>
+            <wp:docPr id="7" name="Picture 7"/>
             <wp:cNvGraphicFramePr>
-              <a:graphicFrameLocks noChangeAspect="1"/>
+              <a:graphicFrameLocks xmlns:a="http://schemas.openxmlformats.org/drawingml/2006/main" noChangeAspect="1"/>
             </wp:cNvGraphicFramePr>
-            <a:graphic>
+            <a:graphic xmlns:a="http://schemas.openxmlformats.org/drawingml/2006/main">
               <a:graphicData uri="http://schemas.openxmlformats.org/drawingml/2006/picture">
-                <pic:pic>
+                <pic:pic xmlns:pic="http://schemas.openxmlformats.org/drawingml/2006/picture">
                   <pic:nvPicPr>
-                    <pic:cNvPr id="0" name="Symptom Input.png"/>
+                    <pic:cNvPr id="0" name="Prompt Generation.png"/>
                     <pic:cNvPicPr/>
                   </pic:nvPicPr>
                   <pic:blipFill>
@@ -1745,9 +1957,11 @@
                   <pic:spPr>
                     <a:xfrm>
                       <a:off x="0" y="0"/>
-                      <a:ext cx="5120640" cy="5971716"/>
+                      <a:ext cx="5120640" cy="376980"/>
                     </a:xfrm>
-                    <a:prstGeom prst="rect"/>
+                    <a:prstGeom prst="rect">
+                      <a:avLst/>
+                    </a:prstGeom>
                   </pic:spPr>
                 </pic:pic>
               </a:graphicData>
@@ -1771,7 +1985,7 @@
         <w:rPr>
           <w:b/>
         </w:rPr>
-        <w:t>Extracted Symptoms:</w:t>
+        <w:t>GPT-4 Response:</w:t>
       </w:r>
     </w:p>
     <w:p>
@@ -1779,18 +1993,22 @@
         <w:jc w:val="center"/>
       </w:pPr>
       <w:r>
+        <w:rPr>
+          <w:noProof/>
+        </w:rPr>
         <w:drawing>
-          <wp:inline xmlns:a="http://schemas.openxmlformats.org/drawingml/2006/main" xmlns:pic="http://schemas.openxmlformats.org/drawingml/2006/picture">
-            <wp:extent cx="5120640" cy="1019630"/>
-            <wp:docPr id="5" name="Picture 5"/>
+          <wp:inline distT="0" distB="0" distL="0" distR="0" wp14:anchorId="4F136A8A" wp14:editId="4F136A8B">
+            <wp:extent cx="5120640" cy="3851329"/>
+            <wp:effectExtent l="0" t="0" r="0" b="0"/>
+            <wp:docPr id="8" name="Picture 8"/>
             <wp:cNvGraphicFramePr>
-              <a:graphicFrameLocks noChangeAspect="1"/>
+              <a:graphicFrameLocks xmlns:a="http://schemas.openxmlformats.org/drawingml/2006/main" noChangeAspect="1"/>
             </wp:cNvGraphicFramePr>
-            <a:graphic>
+            <a:graphic xmlns:a="http://schemas.openxmlformats.org/drawingml/2006/main">
               <a:graphicData uri="http://schemas.openxmlformats.org/drawingml/2006/picture">
-                <pic:pic>
+                <pic:pic xmlns:pic="http://schemas.openxmlformats.org/drawingml/2006/picture">
                   <pic:nvPicPr>
-                    <pic:cNvPr id="0" name="Extracted Symptoms.png"/>
+                    <pic:cNvPr id="0" name="GPT-4 Response.png"/>
                     <pic:cNvPicPr/>
                   </pic:nvPicPr>
                   <pic:blipFill>
@@ -1802,9 +2020,11 @@
                   <pic:spPr>
                     <a:xfrm>
                       <a:off x="0" y="0"/>
-                      <a:ext cx="5120640" cy="1019630"/>
+                      <a:ext cx="5120640" cy="3851329"/>
                     </a:xfrm>
-                    <a:prstGeom prst="rect"/>
+                    <a:prstGeom prst="rect">
+                      <a:avLst/>
+                    </a:prstGeom>
                   </pic:spPr>
                 </pic:pic>
               </a:graphicData>
@@ -1828,7 +2048,7 @@
         <w:rPr>
           <w:b/>
         </w:rPr>
-        <w:t>Context Analysis:</w:t>
+        <w:t>Possible Conditions:</w:t>
       </w:r>
     </w:p>
     <w:p>
@@ -1836,18 +2056,86 @@
         <w:jc w:val="center"/>
       </w:pPr>
       <w:r>
+        <w:rPr>
+          <w:noProof/>
+        </w:rPr>
+        <w:lastRenderedPageBreak/>
         <w:drawing>
-          <wp:inline xmlns:a="http://schemas.openxmlformats.org/drawingml/2006/main" xmlns:pic="http://schemas.openxmlformats.org/drawingml/2006/picture">
-            <wp:extent cx="5120640" cy="3207195"/>
-            <wp:docPr id="6" name="Picture 6"/>
+          <wp:inline distT="0" distB="0" distL="0" distR="0" wp14:anchorId="4F136A8C" wp14:editId="4F136A8D">
+            <wp:extent cx="5120640" cy="3851329"/>
+            <wp:effectExtent l="0" t="0" r="0" b="0"/>
+            <wp:docPr id="9" name="Picture 9"/>
             <wp:cNvGraphicFramePr>
-              <a:graphicFrameLocks noChangeAspect="1"/>
+              <a:graphicFrameLocks xmlns:a="http://schemas.openxmlformats.org/drawingml/2006/main" noChangeAspect="1"/>
             </wp:cNvGraphicFramePr>
-            <a:graphic>
+            <a:graphic xmlns:a="http://schemas.openxmlformats.org/drawingml/2006/main">
               <a:graphicData uri="http://schemas.openxmlformats.org/drawingml/2006/picture">
-                <pic:pic>
+                <pic:pic xmlns:pic="http://schemas.openxmlformats.org/drawingml/2006/picture">
                   <pic:nvPicPr>
-                    <pic:cNvPr id="0" name="Context Analysis.png"/>
+                    <pic:cNvPr id="0" name="GPT-4 Response.png"/>
+                    <pic:cNvPicPr/>
+                  </pic:nvPicPr>
+                  <pic:blipFill>
+                    <a:blip r:embed="rId17"/>
+                    <a:stretch>
+                      <a:fillRect/>
+                    </a:stretch>
+                  </pic:blipFill>
+                  <pic:spPr>
+                    <a:xfrm>
+                      <a:off x="0" y="0"/>
+                      <a:ext cx="5120640" cy="3851329"/>
+                    </a:xfrm>
+                    <a:prstGeom prst="rect">
+                      <a:avLst/>
+                    </a:prstGeom>
+                  </pic:spPr>
+                </pic:pic>
+              </a:graphicData>
+            </a:graphic>
+          </wp:inline>
+        </w:drawing>
+      </w:r>
+    </w:p>
+    <w:p>
+      <w:pPr>
+        <w:pStyle w:val="BodyText"/>
+        <w:numPr>
+          <w:ilvl w:val="0"/>
+          <w:numId w:val="12"/>
+        </w:numPr>
+        <w:rPr>
+          <w:lang w:val="en-IN" w:eastAsia="en-IN"/>
+        </w:rPr>
+      </w:pPr>
+      <w:r>
+        <w:rPr>
+          <w:b/>
+        </w:rPr>
+        <w:t>Follow-up Questions:</w:t>
+      </w:r>
+    </w:p>
+    <w:p>
+      <w:pPr>
+        <w:jc w:val="center"/>
+      </w:pPr>
+      <w:r>
+        <w:rPr>
+          <w:noProof/>
+        </w:rPr>
+        <w:drawing>
+          <wp:inline distT="0" distB="0" distL="0" distR="0" wp14:anchorId="4F136A8E" wp14:editId="4F136A8F">
+            <wp:extent cx="5120640" cy="3888687"/>
+            <wp:effectExtent l="0" t="0" r="0" b="0"/>
+            <wp:docPr id="10" name="Picture 10"/>
+            <wp:cNvGraphicFramePr>
+              <a:graphicFrameLocks xmlns:a="http://schemas.openxmlformats.org/drawingml/2006/main" noChangeAspect="1"/>
+            </wp:cNvGraphicFramePr>
+            <a:graphic xmlns:a="http://schemas.openxmlformats.org/drawingml/2006/main">
+              <a:graphicData uri="http://schemas.openxmlformats.org/drawingml/2006/picture">
+                <pic:pic xmlns:pic="http://schemas.openxmlformats.org/drawingml/2006/picture">
+                  <pic:nvPicPr>
+                    <pic:cNvPr id="0" name="Follow-up Questions.png"/>
                     <pic:cNvPicPr/>
                   </pic:nvPicPr>
                   <pic:blipFill>
@@ -1859,9 +2147,11 @@
                   <pic:spPr>
                     <a:xfrm>
                       <a:off x="0" y="0"/>
-                      <a:ext cx="5120640" cy="3207195"/>
+                      <a:ext cx="5120640" cy="3888687"/>
                     </a:xfrm>
-                    <a:prstGeom prst="rect"/>
+                    <a:prstGeom prst="rect">
+                      <a:avLst/>
+                    </a:prstGeom>
                   </pic:spPr>
                 </pic:pic>
               </a:graphicData>
@@ -1885,7 +2175,7 @@
         <w:rPr>
           <w:b/>
         </w:rPr>
-        <w:t>Prompt Generation:</w:t>
+        <w:t>Medical Attention Guidance:</w:t>
       </w:r>
     </w:p>
     <w:p>
@@ -1893,18 +2183,22 @@
         <w:jc w:val="center"/>
       </w:pPr>
       <w:r>
+        <w:rPr>
+          <w:noProof/>
+        </w:rPr>
         <w:drawing>
-          <wp:inline xmlns:a="http://schemas.openxmlformats.org/drawingml/2006/main" xmlns:pic="http://schemas.openxmlformats.org/drawingml/2006/picture">
-            <wp:extent cx="5120640" cy="376980"/>
-            <wp:docPr id="7" name="Picture 7"/>
+          <wp:inline distT="0" distB="0" distL="0" distR="0" wp14:anchorId="4F136A90" wp14:editId="4F136A91">
+            <wp:extent cx="5120640" cy="1360505"/>
+            <wp:effectExtent l="0" t="0" r="0" b="0"/>
+            <wp:docPr id="11" name="Picture 11"/>
             <wp:cNvGraphicFramePr>
-              <a:graphicFrameLocks noChangeAspect="1"/>
+              <a:graphicFrameLocks xmlns:a="http://schemas.openxmlformats.org/drawingml/2006/main" noChangeAspect="1"/>
             </wp:cNvGraphicFramePr>
-            <a:graphic>
+            <a:graphic xmlns:a="http://schemas.openxmlformats.org/drawingml/2006/main">
               <a:graphicData uri="http://schemas.openxmlformats.org/drawingml/2006/picture">
-                <pic:pic>
+                <pic:pic xmlns:pic="http://schemas.openxmlformats.org/drawingml/2006/picture">
                   <pic:nvPicPr>
-                    <pic:cNvPr id="0" name="Prompt Generation.png"/>
+                    <pic:cNvPr id="0" name="Triage Guidance.png"/>
                     <pic:cNvPicPr/>
                   </pic:nvPicPr>
                   <pic:blipFill>
@@ -1916,9 +2210,11 @@
                   <pic:spPr>
                     <a:xfrm>
                       <a:off x="0" y="0"/>
-                      <a:ext cx="5120640" cy="376980"/>
+                      <a:ext cx="5120640" cy="1360505"/>
                     </a:xfrm>
-                    <a:prstGeom prst="rect"/>
+                    <a:prstGeom prst="rect">
+                      <a:avLst/>
+                    </a:prstGeom>
                   </pic:spPr>
                 </pic:pic>
               </a:graphicData>
@@ -1942,7 +2238,8 @@
         <w:rPr>
           <w:b/>
         </w:rPr>
-        <w:t>GPT-4 Response:</w:t>
+        <w:lastRenderedPageBreak/>
+        <w:t>Complete Structured Analysis:</w:t>
       </w:r>
     </w:p>
     <w:p>
@@ -1950,18 +2247,22 @@
         <w:jc w:val="center"/>
       </w:pPr>
       <w:r>
+        <w:rPr>
+          <w:noProof/>
+        </w:rPr>
         <w:drawing>
-          <wp:inline xmlns:a="http://schemas.openxmlformats.org/drawingml/2006/main" xmlns:pic="http://schemas.openxmlformats.org/drawingml/2006/picture">
-            <wp:extent cx="5120640" cy="3851329"/>
-            <wp:docPr id="8" name="Picture 8"/>
+          <wp:inline distT="0" distB="0" distL="0" distR="0" wp14:anchorId="4F136A92" wp14:editId="4F136A93">
+            <wp:extent cx="5120640" cy="2529126"/>
+            <wp:effectExtent l="0" t="0" r="0" b="0"/>
+            <wp:docPr id="12" name="Picture 12"/>
             <wp:cNvGraphicFramePr>
-              <a:graphicFrameLocks noChangeAspect="1"/>
+              <a:graphicFrameLocks xmlns:a="http://schemas.openxmlformats.org/drawingml/2006/main" noChangeAspect="1"/>
             </wp:cNvGraphicFramePr>
-            <a:graphic>
+            <a:graphic xmlns:a="http://schemas.openxmlformats.org/drawingml/2006/main">
               <a:graphicData uri="http://schemas.openxmlformats.org/drawingml/2006/picture">
-                <pic:pic>
+                <pic:pic xmlns:pic="http://schemas.openxmlformats.org/drawingml/2006/picture">
                   <pic:nvPicPr>
-                    <pic:cNvPr id="0" name="GPT-4 Response.png"/>
+                    <pic:cNvPr id="0" name="Structured Report.png"/>
                     <pic:cNvPicPr/>
                   </pic:nvPicPr>
                   <pic:blipFill>
@@ -1973,9 +2274,11 @@
                   <pic:spPr>
                     <a:xfrm>
                       <a:off x="0" y="0"/>
-                      <a:ext cx="5120640" cy="3851329"/>
+                      <a:ext cx="5120640" cy="2529126"/>
                     </a:xfrm>
-                    <a:prstGeom prst="rect"/>
+                    <a:prstGeom prst="rect">
+                      <a:avLst/>
+                    </a:prstGeom>
                   </pic:spPr>
                 </pic:pic>
               </a:graphicData>
@@ -1999,7 +2302,7 @@
         <w:rPr>
           <w:b/>
         </w:rPr>
-        <w:t>Possible Conditions:</w:t>
+        <w:t>Disclaimer:</w:t>
       </w:r>
     </w:p>
     <w:p>
@@ -2007,75 +2310,22 @@
         <w:jc w:val="center"/>
       </w:pPr>
       <w:r>
+        <w:rPr>
+          <w:noProof/>
+        </w:rPr>
         <w:drawing>
-          <wp:inline xmlns:a="http://schemas.openxmlformats.org/drawingml/2006/main" xmlns:pic="http://schemas.openxmlformats.org/drawingml/2006/picture">
-            <wp:extent cx="5120640" cy="3851329"/>
-            <wp:docPr id="9" name="Picture 9"/>
+          <wp:inline distT="0" distB="0" distL="0" distR="0" wp14:anchorId="4F136A94" wp14:editId="4F136A95">
+            <wp:extent cx="5120640" cy="1563143"/>
+            <wp:effectExtent l="0" t="0" r="0" b="0"/>
+            <wp:docPr id="13" name="Picture 13"/>
             <wp:cNvGraphicFramePr>
-              <a:graphicFrameLocks noChangeAspect="1"/>
+              <a:graphicFrameLocks xmlns:a="http://schemas.openxmlformats.org/drawingml/2006/main" noChangeAspect="1"/>
             </wp:cNvGraphicFramePr>
-            <a:graphic>
+            <a:graphic xmlns:a="http://schemas.openxmlformats.org/drawingml/2006/main">
               <a:graphicData uri="http://schemas.openxmlformats.org/drawingml/2006/picture">
-                <pic:pic>
+                <pic:pic xmlns:pic="http://schemas.openxmlformats.org/drawingml/2006/picture">
                   <pic:nvPicPr>
-                    <pic:cNvPr id="0" name="GPT-4 Response.png"/>
-                    <pic:cNvPicPr/>
-                  </pic:nvPicPr>
-                  <pic:blipFill>
-                    <a:blip r:embed="rId20"/>
-                    <a:stretch>
-                      <a:fillRect/>
-                    </a:stretch>
-                  </pic:blipFill>
-                  <pic:spPr>
-                    <a:xfrm>
-                      <a:off x="0" y="0"/>
-                      <a:ext cx="5120640" cy="3851329"/>
-                    </a:xfrm>
-                    <a:prstGeom prst="rect"/>
-                  </pic:spPr>
-                </pic:pic>
-              </a:graphicData>
-            </a:graphic>
-          </wp:inline>
-        </w:drawing>
-      </w:r>
-    </w:p>
-    <w:p>
-      <w:pPr>
-        <w:pStyle w:val="BodyText"/>
-        <w:numPr>
-          <w:ilvl w:val="0"/>
-          <w:numId w:val="12"/>
-        </w:numPr>
-        <w:rPr>
-          <w:lang w:val="en-IN" w:eastAsia="en-IN"/>
-        </w:rPr>
-      </w:pPr>
-      <w:r>
-        <w:rPr>
-          <w:b/>
-        </w:rPr>
-        <w:t>Follow-up Questions:</w:t>
-      </w:r>
-    </w:p>
-    <w:p>
-      <w:pPr>
-        <w:jc w:val="center"/>
-      </w:pPr>
-      <w:r>
-        <w:drawing>
-          <wp:inline xmlns:a="http://schemas.openxmlformats.org/drawingml/2006/main" xmlns:pic="http://schemas.openxmlformats.org/drawingml/2006/picture">
-            <wp:extent cx="5120640" cy="3888687"/>
-            <wp:docPr id="10" name="Picture 10"/>
-            <wp:cNvGraphicFramePr>
-              <a:graphicFrameLocks noChangeAspect="1"/>
-            </wp:cNvGraphicFramePr>
-            <a:graphic>
-              <a:graphicData uri="http://schemas.openxmlformats.org/drawingml/2006/picture">
-                <pic:pic>
-                  <pic:nvPicPr>
-                    <pic:cNvPr id="0" name="Follow-up Questions.png"/>
+                    <pic:cNvPr id="0" name="Disclaimer.png"/>
                     <pic:cNvPicPr/>
                   </pic:nvPicPr>
                   <pic:blipFill>
@@ -2087,9 +2337,11 @@
                   <pic:spPr>
                     <a:xfrm>
                       <a:off x="0" y="0"/>
-                      <a:ext cx="5120640" cy="3888687"/>
+                      <a:ext cx="5120640" cy="1563143"/>
                     </a:xfrm>
-                    <a:prstGeom prst="rect"/>
+                    <a:prstGeom prst="rect">
+                      <a:avLst/>
+                    </a:prstGeom>
                   </pic:spPr>
                 </pic:pic>
               </a:graphicData>
@@ -2106,14 +2358,15 @@
           <w:numId w:val="12"/>
         </w:numPr>
         <w:rPr>
-          <w:lang w:val="en-IN" w:eastAsia="en-IN"/>
-        </w:rPr>
-      </w:pPr>
-      <w:r>
-        <w:rPr>
           <w:b/>
-        </w:rPr>
-        <w:t>Medical Attention Guidance:</w:t>
+          <w:sz w:val="28"/>
+        </w:rPr>
+      </w:pPr>
+      <w:r>
+        <w:rPr>
+          <w:b/>
+        </w:rPr>
+        <w:t>Saved Report:</w:t>
       </w:r>
     </w:p>
     <w:p>
@@ -2121,18 +2374,22 @@
         <w:jc w:val="center"/>
       </w:pPr>
       <w:r>
+        <w:rPr>
+          <w:noProof/>
+        </w:rPr>
         <w:drawing>
-          <wp:inline xmlns:a="http://schemas.openxmlformats.org/drawingml/2006/main" xmlns:pic="http://schemas.openxmlformats.org/drawingml/2006/picture">
-            <wp:extent cx="5120640" cy="1360505"/>
-            <wp:docPr id="11" name="Picture 11"/>
+          <wp:inline distT="0" distB="0" distL="0" distR="0" wp14:anchorId="4F136A96" wp14:editId="4F136A97">
+            <wp:extent cx="5120640" cy="2560320"/>
+            <wp:effectExtent l="0" t="0" r="0" b="0"/>
+            <wp:docPr id="14" name="Picture 14"/>
             <wp:cNvGraphicFramePr>
-              <a:graphicFrameLocks noChangeAspect="1"/>
+              <a:graphicFrameLocks xmlns:a="http://schemas.openxmlformats.org/drawingml/2006/main" noChangeAspect="1"/>
             </wp:cNvGraphicFramePr>
-            <a:graphic>
+            <a:graphic xmlns:a="http://schemas.openxmlformats.org/drawingml/2006/main">
               <a:graphicData uri="http://schemas.openxmlformats.org/drawingml/2006/picture">
-                <pic:pic>
+                <pic:pic xmlns:pic="http://schemas.openxmlformats.org/drawingml/2006/picture">
                   <pic:nvPicPr>
-                    <pic:cNvPr id="0" name="Triage Guidance.png"/>
+                    <pic:cNvPr id="0" name="Saved Report.png"/>
                     <pic:cNvPicPr/>
                   </pic:nvPicPr>
                   <pic:blipFill>
@@ -2144,9 +2401,11 @@
                   <pic:spPr>
                     <a:xfrm>
                       <a:off x="0" y="0"/>
-                      <a:ext cx="5120640" cy="1360505"/>
+                      <a:ext cx="5120640" cy="2560320"/>
                     </a:xfrm>
-                    <a:prstGeom prst="rect"/>
+                    <a:prstGeom prst="rect">
+                      <a:avLst/>
+                    </a:prstGeom>
                   </pic:spPr>
                 </pic:pic>
               </a:graphicData>
@@ -2158,178 +2417,6 @@
     <w:p>
       <w:pPr>
         <w:pStyle w:val="BodyText"/>
-        <w:numPr>
-          <w:ilvl w:val="0"/>
-          <w:numId w:val="12"/>
-        </w:numPr>
-        <w:rPr>
-          <w:lang w:val="en-IN" w:eastAsia="en-IN"/>
-        </w:rPr>
-      </w:pPr>
-      <w:r>
-        <w:rPr>
-          <w:b/>
-        </w:rPr>
-        <w:t>Complete Structured Analysis:</w:t>
-      </w:r>
-    </w:p>
-    <w:p>
-      <w:pPr>
-        <w:jc w:val="center"/>
-      </w:pPr>
-      <w:r>
-        <w:drawing>
-          <wp:inline xmlns:a="http://schemas.openxmlformats.org/drawingml/2006/main" xmlns:pic="http://schemas.openxmlformats.org/drawingml/2006/picture">
-            <wp:extent cx="5120640" cy="2529126"/>
-            <wp:docPr id="12" name="Picture 12"/>
-            <wp:cNvGraphicFramePr>
-              <a:graphicFrameLocks noChangeAspect="1"/>
-            </wp:cNvGraphicFramePr>
-            <a:graphic>
-              <a:graphicData uri="http://schemas.openxmlformats.org/drawingml/2006/picture">
-                <pic:pic>
-                  <pic:nvPicPr>
-                    <pic:cNvPr id="0" name="Structured Report.png"/>
-                    <pic:cNvPicPr/>
-                  </pic:nvPicPr>
-                  <pic:blipFill>
-                    <a:blip r:embed="rId23"/>
-                    <a:stretch>
-                      <a:fillRect/>
-                    </a:stretch>
-                  </pic:blipFill>
-                  <pic:spPr>
-                    <a:xfrm>
-                      <a:off x="0" y="0"/>
-                      <a:ext cx="5120640" cy="2529126"/>
-                    </a:xfrm>
-                    <a:prstGeom prst="rect"/>
-                  </pic:spPr>
-                </pic:pic>
-              </a:graphicData>
-            </a:graphic>
-          </wp:inline>
-        </w:drawing>
-      </w:r>
-    </w:p>
-    <w:p>
-      <w:pPr>
-        <w:pStyle w:val="BodyText"/>
-        <w:numPr>
-          <w:ilvl w:val="0"/>
-          <w:numId w:val="12"/>
-        </w:numPr>
-        <w:rPr>
-          <w:lang w:val="en-IN" w:eastAsia="en-IN"/>
-        </w:rPr>
-      </w:pPr>
-      <w:r>
-        <w:rPr>
-          <w:b/>
-        </w:rPr>
-        <w:t>Disclaimer:</w:t>
-      </w:r>
-    </w:p>
-    <w:p>
-      <w:pPr>
-        <w:jc w:val="center"/>
-      </w:pPr>
-      <w:r>
-        <w:drawing>
-          <wp:inline xmlns:a="http://schemas.openxmlformats.org/drawingml/2006/main" xmlns:pic="http://schemas.openxmlformats.org/drawingml/2006/picture">
-            <wp:extent cx="5120640" cy="1563143"/>
-            <wp:docPr id="13" name="Picture 13"/>
-            <wp:cNvGraphicFramePr>
-              <a:graphicFrameLocks noChangeAspect="1"/>
-            </wp:cNvGraphicFramePr>
-            <a:graphic>
-              <a:graphicData uri="http://schemas.openxmlformats.org/drawingml/2006/picture">
-                <pic:pic>
-                  <pic:nvPicPr>
-                    <pic:cNvPr id="0" name="Disclaimer.png"/>
-                    <pic:cNvPicPr/>
-                  </pic:nvPicPr>
-                  <pic:blipFill>
-                    <a:blip r:embed="rId24"/>
-                    <a:stretch>
-                      <a:fillRect/>
-                    </a:stretch>
-                  </pic:blipFill>
-                  <pic:spPr>
-                    <a:xfrm>
-                      <a:off x="0" y="0"/>
-                      <a:ext cx="5120640" cy="1563143"/>
-                    </a:xfrm>
-                    <a:prstGeom prst="rect"/>
-                  </pic:spPr>
-                </pic:pic>
-              </a:graphicData>
-            </a:graphic>
-          </wp:inline>
-        </w:drawing>
-      </w:r>
-    </w:p>
-    <w:p>
-      <w:pPr>
-        <w:pStyle w:val="BodyText"/>
-        <w:numPr>
-          <w:ilvl w:val="0"/>
-          <w:numId w:val="12"/>
-        </w:numPr>
-        <w:rPr>
-          <w:b/>
-          <w:sz w:val="28"/>
-        </w:rPr>
-      </w:pPr>
-      <w:r>
-        <w:rPr>
-          <w:b/>
-        </w:rPr>
-        <w:t>Saved Report:</w:t>
-      </w:r>
-    </w:p>
-    <w:p>
-      <w:pPr>
-        <w:jc w:val="center"/>
-      </w:pPr>
-      <w:r>
-        <w:drawing>
-          <wp:inline xmlns:a="http://schemas.openxmlformats.org/drawingml/2006/main" xmlns:pic="http://schemas.openxmlformats.org/drawingml/2006/picture">
-            <wp:extent cx="5120640" cy="2560320"/>
-            <wp:docPr id="14" name="Picture 14"/>
-            <wp:cNvGraphicFramePr>
-              <a:graphicFrameLocks noChangeAspect="1"/>
-            </wp:cNvGraphicFramePr>
-            <a:graphic>
-              <a:graphicData uri="http://schemas.openxmlformats.org/drawingml/2006/picture">
-                <pic:pic>
-                  <pic:nvPicPr>
-                    <pic:cNvPr id="0" name="Saved Report.png"/>
-                    <pic:cNvPicPr/>
-                  </pic:nvPicPr>
-                  <pic:blipFill>
-                    <a:blip r:embed="rId25"/>
-                    <a:stretch>
-                      <a:fillRect/>
-                    </a:stretch>
-                  </pic:blipFill>
-                  <pic:spPr>
-                    <a:xfrm>
-                      <a:off x="0" y="0"/>
-                      <a:ext cx="5120640" cy="2560320"/>
-                    </a:xfrm>
-                    <a:prstGeom prst="rect"/>
-                  </pic:spPr>
-                </pic:pic>
-              </a:graphicData>
-            </a:graphic>
-          </wp:inline>
-        </w:drawing>
-      </w:r>
-    </w:p>
-    <w:p>
-      <w:pPr>
-        <w:pStyle w:val="BodyText"/>
         <w:ind w:left="0"/>
         <w:rPr>
           <w:b/>
@@ -2413,8 +2500,6 @@
       <w:r>
         <w:t xml:space="preserve"> was successfully developed. The system accepts user-reported symptoms and relevant contextual information, performs preliminary symptom analysis, generates possible conditions and follow-up questions, provides appropriate medical-attention guidance and produces a structured informational response with a safety disclaimer.</w:t>
       </w:r>
-      <w:bookmarkStart w:id="0" w:name="_GoBack"/>
-      <w:bookmarkEnd w:id="0"/>
     </w:p>
     <w:sectPr>
       <w:type w:val="continuous"/>
@@ -2433,7 +2518,7 @@
 </file>
 
 <file path=word/endnotes.xml><?xml version="1.0" encoding="utf-8"?>
-<w:endnotes xmlns:wpc="http://schemas.microsoft.com/office/word/2010/wordprocessingCanvas" xmlns:mc="http://schemas.openxmlformats.org/markup-compatibility/2006" xmlns:o="urn:schemas-microsoft-com:office:office" xmlns:r="http://schemas.openxmlformats.org/officeDocument/2006/relationships" xmlns:m="http://schemas.openxmlformats.org/officeDocument/2006/math" xmlns:v="urn:schemas-microsoft-com:vml" xmlns:wp14="http://schemas.microsoft.com/office/word/2010/wordprocessingDrawing" xmlns:wp="http://schemas.openxmlformats.org/drawingml/2006/wordprocessingDrawing" xmlns:w10="urn:schemas-microsoft-com:office:word" xmlns:w="http://schemas.openxmlformats.org/wordprocessingml/2006/main" xmlns:w14="http://schemas.microsoft.com/office/word/2010/wordml" xmlns:wpg="http://schemas.microsoft.com/office/word/2010/wordprocessingGroup" xmlns:wpi="http://schemas.microsoft.com/office/word/2010/wordprocessingInk" xmlns:wne="http://schemas.microsoft.com/office/word/2006/wordml" xmlns:wps="http://schemas.microsoft.com/office/word/2010/wordprocessingShape" mc:Ignorable="w14 wp14">
+<w:endnotes xmlns:wpc="http://schemas.microsoft.com/office/word/2010/wordprocessingCanvas" xmlns:cx="http://schemas.microsoft.com/office/drawing/2014/chartex" xmlns:cx1="http://schemas.microsoft.com/office/drawing/2015/9/8/chartex" xmlns:cx2="http://schemas.microsoft.com/office/drawing/2015/10/21/chartex" xmlns:cx3="http://schemas.microsoft.com/office/drawing/2016/5/9/chartex" xmlns:cx4="http://schemas.microsoft.com/office/drawing/2016/5/10/chartex" xmlns:cx5="http://schemas.microsoft.com/office/drawing/2016/5/11/chartex" xmlns:cx6="http://schemas.microsoft.com/office/drawing/2016/5/12/chartex" xmlns:cx7="http://schemas.microsoft.com/office/drawing/2016/5/13/chartex" xmlns:cx8="http://schemas.microsoft.com/office/drawing/2016/5/14/chartex" xmlns:mc="http://schemas.openxmlformats.org/markup-compatibility/2006" xmlns:aink="http://schemas.microsoft.com/office/drawing/2016/ink" xmlns:am3d="http://schemas.microsoft.com/office/drawing/2017/model3d" xmlns:o="urn:schemas-microsoft-com:office:office" xmlns:oel="http://schemas.microsoft.com/office/2019/extlst" xmlns:r="http://schemas.openxmlformats.org/officeDocument/2006/relationships" xmlns:m="http://schemas.openxmlformats.org/officeDocument/2006/math" xmlns:v="urn:schemas-microsoft-com:vml" xmlns:wp14="http://schemas.microsoft.com/office/word/2010/wordprocessingDrawing" xmlns:wp="http://schemas.openxmlformats.org/drawingml/2006/wordprocessingDrawing" xmlns:w10="urn:schemas-microsoft-com:office:word" xmlns:w="http://schemas.openxmlformats.org/wordprocessingml/2006/main" xmlns:w14="http://schemas.microsoft.com/office/word/2010/wordml" xmlns:w15="http://schemas.microsoft.com/office/word/2012/wordml" xmlns:w16cex="http://schemas.microsoft.com/office/word/2018/wordml/cex" xmlns:w16cid="http://schemas.microsoft.com/office/word/2016/wordml/cid" xmlns:w16="http://schemas.microsoft.com/office/word/2018/wordml" xmlns:w16du="http://schemas.microsoft.com/office/word/2023/wordml/word16du" xmlns:w16sdtdh="http://schemas.microsoft.com/office/word/2020/wordml/sdtdatahash" xmlns:w16sdtfl="http://schemas.microsoft.com/office/word/2024/wordml/sdtformatlock" xmlns:w16se="http://schemas.microsoft.com/office/word/2015/wordml/symex" xmlns:wpg="http://schemas.microsoft.com/office/word/2010/wordprocessingGroup" xmlns:wpi="http://schemas.microsoft.com/office/word/2010/wordprocessingInk" xmlns:wne="http://schemas.microsoft.com/office/word/2006/wordml" xmlns:wps="http://schemas.microsoft.com/office/word/2010/wordprocessingShape" mc:Ignorable="w14 w15 w16se w16cid w16 w16cex w16sdtdh w16sdtfl w16du wp14">
   <w:endnote w:type="separator" w:id="-1">
     <w:p>
       <w:r>
@@ -2452,7 +2537,7 @@
 </file>
 
 <file path=word/footnotes.xml><?xml version="1.0" encoding="utf-8"?>
-<w:footnotes xmlns:wpc="http://schemas.microsoft.com/office/word/2010/wordprocessingCanvas" xmlns:mc="http://schemas.openxmlformats.org/markup-compatibility/2006" xmlns:o="urn:schemas-microsoft-com:office:office" xmlns:r="http://schemas.openxmlformats.org/officeDocument/2006/relationships" xmlns:m="http://schemas.openxmlformats.org/officeDocument/2006/math" xmlns:v="urn:schemas-microsoft-com:vml" xmlns:wp14="http://schemas.microsoft.com/office/word/2010/wordprocessingDrawing" xmlns:wp="http://schemas.openxmlformats.org/drawingml/2006/wordprocessingDrawing" xmlns:w10="urn:schemas-microsoft-com:office:word" xmlns:w="http://schemas.openxmlformats.org/wordprocessingml/2006/main" xmlns:w14="http://schemas.microsoft.com/office/word/2010/wordml" xmlns:wpg="http://schemas.microsoft.com/office/word/2010/wordprocessingGroup" xmlns:wpi="http://schemas.microsoft.com/office/word/2010/wordprocessingInk" xmlns:wne="http://schemas.microsoft.com/office/word/2006/wordml" xmlns:wps="http://schemas.microsoft.com/office/word/2010/wordprocessingShape" mc:Ignorable="w14 wp14">
+<w:footnotes xmlns:wpc="http://schemas.microsoft.com/office/word/2010/wordprocessingCanvas" xmlns:cx="http://schemas.microsoft.com/office/drawing/2014/chartex" xmlns:cx1="http://schemas.microsoft.com/office/drawing/2015/9/8/chartex" xmlns:cx2="http://schemas.microsoft.com/office/drawing/2015/10/21/chartex" xmlns:cx3="http://schemas.microsoft.com/office/drawing/2016/5/9/chartex" xmlns:cx4="http://schemas.microsoft.com/office/drawing/2016/5/10/chartex" xmlns:cx5="http://schemas.microsoft.com/office/drawing/2016/5/11/chartex" xmlns:cx6="http://schemas.microsoft.com/office/drawing/2016/5/12/chartex" xmlns:cx7="http://schemas.microsoft.com/office/drawing/2016/5/13/chartex" xmlns:cx8="http://schemas.microsoft.com/office/drawing/2016/5/14/chartex" xmlns:mc="http://schemas.openxmlformats.org/markup-compatibility/2006" xmlns:aink="http://schemas.microsoft.com/office/drawing/2016/ink" xmlns:am3d="http://schemas.microsoft.com/office/drawing/2017/model3d" xmlns:o="urn:schemas-microsoft-com:office:office" xmlns:oel="http://schemas.microsoft.com/office/2019/extlst" xmlns:r="http://schemas.openxmlformats.org/officeDocument/2006/relationships" xmlns:m="http://schemas.openxmlformats.org/officeDocument/2006/math" xmlns:v="urn:schemas-microsoft-com:vml" xmlns:wp14="http://schemas.microsoft.com/office/word/2010/wordprocessingDrawing" xmlns:wp="http://schemas.openxmlformats.org/drawingml/2006/wordprocessingDrawing" xmlns:w10="urn:schemas-microsoft-com:office:word" xmlns:w="http://schemas.openxmlformats.org/wordprocessingml/2006/main" xmlns:w14="http://schemas.microsoft.com/office/word/2010/wordml" xmlns:w15="http://schemas.microsoft.com/office/word/2012/wordml" xmlns:w16cex="http://schemas.microsoft.com/office/word/2018/wordml/cex" xmlns:w16cid="http://schemas.microsoft.com/office/word/2016/wordml/cid" xmlns:w16="http://schemas.microsoft.com/office/word/2018/wordml" xmlns:w16du="http://schemas.microsoft.com/office/word/2023/wordml/word16du" xmlns:w16sdtdh="http://schemas.microsoft.com/office/word/2020/wordml/sdtdatahash" xmlns:w16sdtfl="http://schemas.microsoft.com/office/word/2024/wordml/sdtformatlock" xmlns:w16se="http://schemas.microsoft.com/office/word/2015/wordml/symex" xmlns:wpg="http://schemas.microsoft.com/office/word/2010/wordprocessingGroup" xmlns:wpi="http://schemas.microsoft.com/office/word/2010/wordprocessingInk" xmlns:wne="http://schemas.microsoft.com/office/word/2006/wordml" xmlns:wps="http://schemas.microsoft.com/office/word/2010/wordprocessingShape" mc:Ignorable="w14 w15 w16se w16cid w16 w16cex w16sdtdh w16sdtfl w16du wp14">
   <w:footnote w:type="separator" w:id="-1">
     <w:p>
       <w:r>
@@ -2471,8 +2556,8 @@
 </file>
 
 <file path=word/numbering.xml><?xml version="1.0" encoding="utf-8"?>
-<w:numbering xmlns:wpc="http://schemas.microsoft.com/office/word/2010/wordprocessingCanvas" xmlns:mc="http://schemas.openxmlformats.org/markup-compatibility/2006" xmlns:o="urn:schemas-microsoft-com:office:office" xmlns:r="http://schemas.openxmlformats.org/officeDocument/2006/relationships" xmlns:m="http://schemas.openxmlformats.org/officeDocument/2006/math" xmlns:v="urn:schemas-microsoft-com:vml" xmlns:wp14="http://schemas.microsoft.com/office/word/2010/wordprocessingDrawing" xmlns:wp="http://schemas.openxmlformats.org/drawingml/2006/wordprocessingDrawing" xmlns:w10="urn:schemas-microsoft-com:office:word" xmlns:w="http://schemas.openxmlformats.org/wordprocessingml/2006/main" xmlns:w14="http://schemas.microsoft.com/office/word/2010/wordml" xmlns:wpg="http://schemas.microsoft.com/office/word/2010/wordprocessingGroup" xmlns:wpi="http://schemas.microsoft.com/office/word/2010/wordprocessingInk" xmlns:wne="http://schemas.microsoft.com/office/word/2006/wordml" xmlns:wps="http://schemas.microsoft.com/office/word/2010/wordprocessingShape" mc:Ignorable="w14 wp14">
-  <w:abstractNum w:abstractNumId="0">
+<w:numbering xmlns:wpc="http://schemas.microsoft.com/office/word/2010/wordprocessingCanvas" xmlns:cx="http://schemas.microsoft.com/office/drawing/2014/chartex" xmlns:cx1="http://schemas.microsoft.com/office/drawing/2015/9/8/chartex" xmlns:cx2="http://schemas.microsoft.com/office/drawing/2015/10/21/chartex" xmlns:cx3="http://schemas.microsoft.com/office/drawing/2016/5/9/chartex" xmlns:cx4="http://schemas.microsoft.com/office/drawing/2016/5/10/chartex" xmlns:cx5="http://schemas.microsoft.com/office/drawing/2016/5/11/chartex" xmlns:cx6="http://schemas.microsoft.com/office/drawing/2016/5/12/chartex" xmlns:cx7="http://schemas.microsoft.com/office/drawing/2016/5/13/chartex" xmlns:cx8="http://schemas.microsoft.com/office/drawing/2016/5/14/chartex" xmlns:mc="http://schemas.openxmlformats.org/markup-compatibility/2006" xmlns:aink="http://schemas.microsoft.com/office/drawing/2016/ink" xmlns:am3d="http://schemas.microsoft.com/office/drawing/2017/model3d" xmlns:o="urn:schemas-microsoft-com:office:office" xmlns:oel="http://schemas.microsoft.com/office/2019/extlst" xmlns:r="http://schemas.openxmlformats.org/officeDocument/2006/relationships" xmlns:m="http://schemas.openxmlformats.org/officeDocument/2006/math" xmlns:v="urn:schemas-microsoft-com:vml" xmlns:wp14="http://schemas.microsoft.com/office/word/2010/wordprocessingDrawing" xmlns:wp="http://schemas.openxmlformats.org/drawingml/2006/wordprocessingDrawing" xmlns:w10="urn:schemas-microsoft-com:office:word" xmlns:w="http://schemas.openxmlformats.org/wordprocessingml/2006/main" xmlns:w14="http://schemas.microsoft.com/office/word/2010/wordml" xmlns:w15="http://schemas.microsoft.com/office/word/2012/wordml" xmlns:w16cex="http://schemas.microsoft.com/office/word/2018/wordml/cex" xmlns:w16cid="http://schemas.microsoft.com/office/word/2016/wordml/cid" xmlns:w16="http://schemas.microsoft.com/office/word/2018/wordml" xmlns:w16du="http://schemas.microsoft.com/office/word/2023/wordml/word16du" xmlns:w16sdtdh="http://schemas.microsoft.com/office/word/2020/wordml/sdtdatahash" xmlns:w16sdtfl="http://schemas.microsoft.com/office/word/2024/wordml/sdtformatlock" xmlns:w16se="http://schemas.microsoft.com/office/word/2015/wordml/symex" xmlns:wpg="http://schemas.microsoft.com/office/word/2010/wordprocessingGroup" xmlns:wpi="http://schemas.microsoft.com/office/word/2010/wordprocessingInk" xmlns:wne="http://schemas.microsoft.com/office/word/2006/wordml" xmlns:wps="http://schemas.microsoft.com/office/word/2010/wordprocessingShape" mc:Ignorable="w14 w15 w16se w16cid w16 w16cex w16sdtdh w16sdtfl w16du wp14">
+  <w:abstractNum w:abstractNumId="0" w15:restartNumberingAfterBreak="0">
     <w:nsid w:val="CF092B84"/>
     <w:multiLevelType w:val="multilevel"/>
     <w:tmpl w:val="CF092B84"/>
@@ -2594,7 +2679,7 @@
       </w:rPr>
     </w:lvl>
   </w:abstractNum>
-  <w:abstractNum w:abstractNumId="1">
+  <w:abstractNum w:abstractNumId="1" w15:restartNumberingAfterBreak="0">
     <w:nsid w:val="0053208E"/>
     <w:multiLevelType w:val="multilevel"/>
     <w:tmpl w:val="0053208E"/>
@@ -2723,7 +2808,7 @@
       </w:rPr>
     </w:lvl>
   </w:abstractNum>
-  <w:abstractNum w:abstractNumId="2">
+  <w:abstractNum w:abstractNumId="2" w15:restartNumberingAfterBreak="0">
     <w:nsid w:val="1D5E635A"/>
     <w:multiLevelType w:val="multilevel"/>
     <w:tmpl w:val="7A74567C"/>
@@ -2872,7 +2957,7 @@
       </w:rPr>
     </w:lvl>
   </w:abstractNum>
-  <w:abstractNum w:abstractNumId="3">
+  <w:abstractNum w:abstractNumId="3" w15:restartNumberingAfterBreak="0">
     <w:nsid w:val="1E2359E0"/>
     <w:multiLevelType w:val="multilevel"/>
     <w:tmpl w:val="4D004D2E"/>
@@ -3021,7 +3106,7 @@
       </w:rPr>
     </w:lvl>
   </w:abstractNum>
-  <w:abstractNum w:abstractNumId="4">
+  <w:abstractNum w:abstractNumId="4" w15:restartNumberingAfterBreak="0">
     <w:nsid w:val="2090644F"/>
     <w:multiLevelType w:val="multilevel"/>
     <w:tmpl w:val="12243BFA"/>
@@ -3170,7 +3255,7 @@
       </w:rPr>
     </w:lvl>
   </w:abstractNum>
-  <w:abstractNum w:abstractNumId="5">
+  <w:abstractNum w:abstractNumId="5" w15:restartNumberingAfterBreak="0">
     <w:nsid w:val="34433729"/>
     <w:multiLevelType w:val="hybridMultilevel"/>
     <w:tmpl w:val="C0C866E4"/>
@@ -3283,7 +3368,7 @@
       </w:rPr>
     </w:lvl>
   </w:abstractNum>
-  <w:abstractNum w:abstractNumId="6">
+  <w:abstractNum w:abstractNumId="6" w15:restartNumberingAfterBreak="0">
     <w:nsid w:val="359E3BDC"/>
     <w:multiLevelType w:val="multilevel"/>
     <w:tmpl w:val="43CA08BA"/>
@@ -3396,7 +3481,7 @@
       </w:pPr>
     </w:lvl>
   </w:abstractNum>
-  <w:abstractNum w:abstractNumId="7">
+  <w:abstractNum w:abstractNumId="7" w15:restartNumberingAfterBreak="0">
     <w:nsid w:val="37E7684A"/>
     <w:multiLevelType w:val="multilevel"/>
     <w:tmpl w:val="3D3EE1B2"/>
@@ -3545,7 +3630,7 @@
       </w:rPr>
     </w:lvl>
   </w:abstractNum>
-  <w:abstractNum w:abstractNumId="8">
+  <w:abstractNum w:abstractNumId="8" w15:restartNumberingAfterBreak="0">
     <w:nsid w:val="3EE10904"/>
     <w:multiLevelType w:val="multilevel"/>
     <w:tmpl w:val="FF18F470"/>
@@ -3694,7 +3779,7 @@
       </w:rPr>
     </w:lvl>
   </w:abstractNum>
-  <w:abstractNum w:abstractNumId="9">
+  <w:abstractNum w:abstractNumId="9" w15:restartNumberingAfterBreak="0">
     <w:nsid w:val="61A82D7A"/>
     <w:multiLevelType w:val="multilevel"/>
     <w:tmpl w:val="C8D8BC8C"/>
@@ -3843,7 +3928,7 @@
       </w:rPr>
     </w:lvl>
   </w:abstractNum>
-  <w:abstractNum w:abstractNumId="10">
+  <w:abstractNum w:abstractNumId="10" w15:restartNumberingAfterBreak="0">
     <w:nsid w:val="62E36F31"/>
     <w:multiLevelType w:val="multilevel"/>
     <w:tmpl w:val="DF9E7262"/>
@@ -3992,7 +4077,7 @@
       </w:rPr>
     </w:lvl>
   </w:abstractNum>
-  <w:abstractNum w:abstractNumId="11">
+  <w:abstractNum w:abstractNumId="11" w15:restartNumberingAfterBreak="0">
     <w:nsid w:val="67480BED"/>
     <w:multiLevelType w:val="hybridMultilevel"/>
     <w:tmpl w:val="6DB63A6A"/>
@@ -4105,47 +4190,163 @@
       </w:rPr>
     </w:lvl>
   </w:abstractNum>
-  <w:num w:numId="1">
+  <w:abstractNum w:abstractNumId="12" w15:restartNumberingAfterBreak="0">
+    <w:nsid w:val="725452F0"/>
+    <w:multiLevelType w:val="hybridMultilevel"/>
+    <w:tmpl w:val="02D87B34"/>
+    <w:lvl w:ilvl="0" w:tplc="40090001">
+      <w:start w:val="1"/>
+      <w:numFmt w:val="bullet"/>
+      <w:lvlText w:val=""/>
+      <w:lvlJc w:val="left"/>
+      <w:pPr>
+        <w:ind w:left="885" w:hanging="360"/>
+      </w:pPr>
+      <w:rPr>
+        <w:rFonts w:ascii="Symbol" w:hAnsi="Symbol" w:hint="default"/>
+      </w:rPr>
+    </w:lvl>
+    <w:lvl w:ilvl="1" w:tplc="40090003" w:tentative="1">
+      <w:start w:val="1"/>
+      <w:numFmt w:val="bullet"/>
+      <w:lvlText w:val="o"/>
+      <w:lvlJc w:val="left"/>
+      <w:pPr>
+        <w:ind w:left="1605" w:hanging="360"/>
+      </w:pPr>
+      <w:rPr>
+        <w:rFonts w:ascii="Courier New" w:hAnsi="Courier New" w:cs="Courier New" w:hint="default"/>
+      </w:rPr>
+    </w:lvl>
+    <w:lvl w:ilvl="2" w:tplc="40090005" w:tentative="1">
+      <w:start w:val="1"/>
+      <w:numFmt w:val="bullet"/>
+      <w:lvlText w:val=""/>
+      <w:lvlJc w:val="left"/>
+      <w:pPr>
+        <w:ind w:left="2325" w:hanging="360"/>
+      </w:pPr>
+      <w:rPr>
+        <w:rFonts w:ascii="Wingdings" w:hAnsi="Wingdings" w:hint="default"/>
+      </w:rPr>
+    </w:lvl>
+    <w:lvl w:ilvl="3" w:tplc="40090001" w:tentative="1">
+      <w:start w:val="1"/>
+      <w:numFmt w:val="bullet"/>
+      <w:lvlText w:val=""/>
+      <w:lvlJc w:val="left"/>
+      <w:pPr>
+        <w:ind w:left="3045" w:hanging="360"/>
+      </w:pPr>
+      <w:rPr>
+        <w:rFonts w:ascii="Symbol" w:hAnsi="Symbol" w:hint="default"/>
+      </w:rPr>
+    </w:lvl>
+    <w:lvl w:ilvl="4" w:tplc="40090003" w:tentative="1">
+      <w:start w:val="1"/>
+      <w:numFmt w:val="bullet"/>
+      <w:lvlText w:val="o"/>
+      <w:lvlJc w:val="left"/>
+      <w:pPr>
+        <w:ind w:left="3765" w:hanging="360"/>
+      </w:pPr>
+      <w:rPr>
+        <w:rFonts w:ascii="Courier New" w:hAnsi="Courier New" w:cs="Courier New" w:hint="default"/>
+      </w:rPr>
+    </w:lvl>
+    <w:lvl w:ilvl="5" w:tplc="40090005" w:tentative="1">
+      <w:start w:val="1"/>
+      <w:numFmt w:val="bullet"/>
+      <w:lvlText w:val=""/>
+      <w:lvlJc w:val="left"/>
+      <w:pPr>
+        <w:ind w:left="4485" w:hanging="360"/>
+      </w:pPr>
+      <w:rPr>
+        <w:rFonts w:ascii="Wingdings" w:hAnsi="Wingdings" w:hint="default"/>
+      </w:rPr>
+    </w:lvl>
+    <w:lvl w:ilvl="6" w:tplc="40090001" w:tentative="1">
+      <w:start w:val="1"/>
+      <w:numFmt w:val="bullet"/>
+      <w:lvlText w:val=""/>
+      <w:lvlJc w:val="left"/>
+      <w:pPr>
+        <w:ind w:left="5205" w:hanging="360"/>
+      </w:pPr>
+      <w:rPr>
+        <w:rFonts w:ascii="Symbol" w:hAnsi="Symbol" w:hint="default"/>
+      </w:rPr>
+    </w:lvl>
+    <w:lvl w:ilvl="7" w:tplc="40090003" w:tentative="1">
+      <w:start w:val="1"/>
+      <w:numFmt w:val="bullet"/>
+      <w:lvlText w:val="o"/>
+      <w:lvlJc w:val="left"/>
+      <w:pPr>
+        <w:ind w:left="5925" w:hanging="360"/>
+      </w:pPr>
+      <w:rPr>
+        <w:rFonts w:ascii="Courier New" w:hAnsi="Courier New" w:cs="Courier New" w:hint="default"/>
+      </w:rPr>
+    </w:lvl>
+    <w:lvl w:ilvl="8" w:tplc="40090005" w:tentative="1">
+      <w:start w:val="1"/>
+      <w:numFmt w:val="bullet"/>
+      <w:lvlText w:val=""/>
+      <w:lvlJc w:val="left"/>
+      <w:pPr>
+        <w:ind w:left="6645" w:hanging="360"/>
+      </w:pPr>
+      <w:rPr>
+        <w:rFonts w:ascii="Wingdings" w:hAnsi="Wingdings" w:hint="default"/>
+      </w:rPr>
+    </w:lvl>
+  </w:abstractNum>
+  <w:num w:numId="1" w16cid:durableId="592469869">
     <w:abstractNumId w:val="1"/>
   </w:num>
-  <w:num w:numId="2">
+  <w:num w:numId="2" w16cid:durableId="1382630673">
     <w:abstractNumId w:val="0"/>
   </w:num>
-  <w:num w:numId="3">
+  <w:num w:numId="3" w16cid:durableId="1084568988">
     <w:abstractNumId w:val="8"/>
   </w:num>
-  <w:num w:numId="4">
+  <w:num w:numId="4" w16cid:durableId="950160540">
     <w:abstractNumId w:val="7"/>
   </w:num>
-  <w:num w:numId="5">
+  <w:num w:numId="5" w16cid:durableId="2110588776">
     <w:abstractNumId w:val="9"/>
   </w:num>
-  <w:num w:numId="6">
+  <w:num w:numId="6" w16cid:durableId="767851489">
     <w:abstractNumId w:val="2"/>
   </w:num>
-  <w:num w:numId="7">
+  <w:num w:numId="7" w16cid:durableId="1193612169">
     <w:abstractNumId w:val="4"/>
   </w:num>
-  <w:num w:numId="8">
+  <w:num w:numId="8" w16cid:durableId="562640490">
     <w:abstractNumId w:val="3"/>
   </w:num>
-  <w:num w:numId="9">
+  <w:num w:numId="9" w16cid:durableId="107705830">
     <w:abstractNumId w:val="6"/>
   </w:num>
-  <w:num w:numId="10">
+  <w:num w:numId="10" w16cid:durableId="1755784854">
     <w:abstractNumId w:val="10"/>
   </w:num>
-  <w:num w:numId="11">
+  <w:num w:numId="11" w16cid:durableId="1827478177">
     <w:abstractNumId w:val="11"/>
   </w:num>
-  <w:num w:numId="12">
+  <w:num w:numId="12" w16cid:durableId="772434356">
     <w:abstractNumId w:val="5"/>
+  </w:num>
+  <w:num w:numId="13" w16cid:durableId="156699574">
+    <w:abstractNumId w:val="12"/>
   </w:num>
 </w:numbering>
 </file>
 
 <file path=word/styles.xml><?xml version="1.0" encoding="utf-8"?>
-<w:styles xmlns:mc="http://schemas.openxmlformats.org/markup-compatibility/2006" xmlns:r="http://schemas.openxmlformats.org/officeDocument/2006/relationships" xmlns:w="http://schemas.openxmlformats.org/wordprocessingml/2006/main" xmlns:w14="http://schemas.microsoft.com/office/word/2010/wordml" mc:Ignorable="w14">
+<w:styles xmlns:mc="http://schemas.openxmlformats.org/markup-compatibility/2006" xmlns:r="http://schemas.openxmlformats.org/officeDocument/2006/relationships" xmlns:w="http://schemas.openxmlformats.org/wordprocessingml/2006/main" xmlns:w14="http://schemas.microsoft.com/office/word/2010/wordml" xmlns:w15="http://schemas.microsoft.com/office/word/2012/wordml" xmlns:w16cex="http://schemas.microsoft.com/office/word/2018/wordml/cex" xmlns:w16cid="http://schemas.microsoft.com/office/word/2016/wordml/cid" xmlns:w16="http://schemas.microsoft.com/office/word/2018/wordml" xmlns:w16du="http://schemas.microsoft.com/office/word/2023/wordml/word16du" xmlns:w16sdtdh="http://schemas.microsoft.com/office/word/2020/wordml/sdtdatahash" xmlns:w16sdtfl="http://schemas.microsoft.com/office/word/2024/wordml/sdtformatlock" xmlns:w16se="http://schemas.microsoft.com/office/word/2015/wordml/symex" mc:Ignorable="w14 w15 w16se w16cid w16 w16cex w16sdtdh w16sdtfl w16du">
   <w:docDefaults>
     <w:rPrDefault>
       <w:rPr>
@@ -4155,7 +4356,7 @@
     </w:rPrDefault>
     <w:pPrDefault/>
   </w:docDefaults>
-  <w:latentStyles w:defLockedState="0" w:defUIPriority="0" w:defSemiHidden="0" w:defUnhideWhenUsed="0" w:defQFormat="0" w:count="267">
+  <w:latentStyles w:defLockedState="0" w:defUIPriority="0" w:defSemiHidden="0" w:defUnhideWhenUsed="0" w:defQFormat="0" w:count="376">
     <w:lsdException w:name="Normal" w:uiPriority="1" w:qFormat="1"/>
     <w:lsdException w:name="heading 1" w:uiPriority="1" w:qFormat="1"/>
     <w:lsdException w:name="heading 2" w:uiPriority="1" w:qFormat="1"/>
@@ -4178,11 +4379,54 @@
     <w:lsdException w:name="Normal (Web)" w:uiPriority="99"/>
     <w:lsdException w:name="HTML Code" w:uiPriority="99"/>
     <w:lsdException w:name="HTML Preformatted" w:uiPriority="99"/>
-    <w:lsdException w:name="Normal Table" w:semiHidden="1"/>
+    <w:lsdException w:name="Normal Table" w:semiHidden="1" w:unhideWhenUsed="1"/>
     <w:lsdException w:name="No List" w:semiHidden="1" w:uiPriority="99" w:unhideWhenUsed="1"/>
     <w:lsdException w:name="Outline List 1" w:semiHidden="1" w:uiPriority="99" w:unhideWhenUsed="1"/>
     <w:lsdException w:name="Outline List 2" w:semiHidden="1" w:uiPriority="99" w:unhideWhenUsed="1"/>
     <w:lsdException w:name="Outline List 3" w:semiHidden="1" w:uiPriority="99" w:unhideWhenUsed="1"/>
+    <w:lsdException w:name="Table Simple 1" w:semiHidden="1" w:unhideWhenUsed="1"/>
+    <w:lsdException w:name="Table Simple 2" w:semiHidden="1" w:unhideWhenUsed="1"/>
+    <w:lsdException w:name="Table Simple 3" w:semiHidden="1" w:unhideWhenUsed="1"/>
+    <w:lsdException w:name="Table Classic 1" w:semiHidden="1" w:unhideWhenUsed="1"/>
+    <w:lsdException w:name="Table Classic 2" w:semiHidden="1" w:unhideWhenUsed="1"/>
+    <w:lsdException w:name="Table Classic 3" w:semiHidden="1" w:unhideWhenUsed="1"/>
+    <w:lsdException w:name="Table Classic 4" w:semiHidden="1" w:unhideWhenUsed="1"/>
+    <w:lsdException w:name="Table Colorful 1" w:semiHidden="1" w:unhideWhenUsed="1"/>
+    <w:lsdException w:name="Table Colorful 2" w:semiHidden="1" w:unhideWhenUsed="1"/>
+    <w:lsdException w:name="Table Colorful 3" w:semiHidden="1" w:unhideWhenUsed="1"/>
+    <w:lsdException w:name="Table Columns 1" w:semiHidden="1" w:unhideWhenUsed="1"/>
+    <w:lsdException w:name="Table Columns 2" w:semiHidden="1" w:unhideWhenUsed="1"/>
+    <w:lsdException w:name="Table Columns 3" w:semiHidden="1" w:unhideWhenUsed="1"/>
+    <w:lsdException w:name="Table Columns 4" w:semiHidden="1" w:unhideWhenUsed="1"/>
+    <w:lsdException w:name="Table Columns 5" w:semiHidden="1" w:unhideWhenUsed="1"/>
+    <w:lsdException w:name="Table Grid 1" w:semiHidden="1" w:unhideWhenUsed="1"/>
+    <w:lsdException w:name="Table Grid 2" w:semiHidden="1" w:unhideWhenUsed="1"/>
+    <w:lsdException w:name="Table Grid 3" w:semiHidden="1" w:unhideWhenUsed="1"/>
+    <w:lsdException w:name="Table Grid 4" w:semiHidden="1" w:unhideWhenUsed="1"/>
+    <w:lsdException w:name="Table Grid 5" w:semiHidden="1" w:unhideWhenUsed="1"/>
+    <w:lsdException w:name="Table Grid 6" w:semiHidden="1" w:unhideWhenUsed="1"/>
+    <w:lsdException w:name="Table Grid 7" w:semiHidden="1" w:unhideWhenUsed="1"/>
+    <w:lsdException w:name="Table Grid 8" w:semiHidden="1" w:unhideWhenUsed="1"/>
+    <w:lsdException w:name="Table List 1" w:semiHidden="1" w:unhideWhenUsed="1"/>
+    <w:lsdException w:name="Table List 2" w:semiHidden="1" w:unhideWhenUsed="1"/>
+    <w:lsdException w:name="Table List 3" w:semiHidden="1" w:unhideWhenUsed="1"/>
+    <w:lsdException w:name="Table List 4" w:semiHidden="1" w:unhideWhenUsed="1"/>
+    <w:lsdException w:name="Table List 5" w:semiHidden="1" w:unhideWhenUsed="1"/>
+    <w:lsdException w:name="Table List 6" w:semiHidden="1" w:unhideWhenUsed="1"/>
+    <w:lsdException w:name="Table List 7" w:semiHidden="1" w:unhideWhenUsed="1"/>
+    <w:lsdException w:name="Table List 8" w:semiHidden="1" w:unhideWhenUsed="1"/>
+    <w:lsdException w:name="Table 3D effects 1" w:semiHidden="1" w:unhideWhenUsed="1"/>
+    <w:lsdException w:name="Table 3D effects 2" w:semiHidden="1" w:unhideWhenUsed="1"/>
+    <w:lsdException w:name="Table 3D effects 3" w:semiHidden="1" w:unhideWhenUsed="1"/>
+    <w:lsdException w:name="Table Contemporary" w:semiHidden="1" w:unhideWhenUsed="1"/>
+    <w:lsdException w:name="Table Elegant" w:semiHidden="1" w:unhideWhenUsed="1"/>
+    <w:lsdException w:name="Table Professional" w:semiHidden="1" w:unhideWhenUsed="1"/>
+    <w:lsdException w:name="Table Subtle 1" w:semiHidden="1" w:unhideWhenUsed="1"/>
+    <w:lsdException w:name="Table Subtle 2" w:semiHidden="1" w:unhideWhenUsed="1"/>
+    <w:lsdException w:name="Table Web 1" w:semiHidden="1" w:unhideWhenUsed="1"/>
+    <w:lsdException w:name="Table Web 2" w:semiHidden="1" w:unhideWhenUsed="1"/>
+    <w:lsdException w:name="Table Web 3" w:semiHidden="1" w:unhideWhenUsed="1"/>
+    <w:lsdException w:name="Table Theme" w:semiHidden="1" w:unhideWhenUsed="1"/>
     <w:lsdException w:name="Placeholder Text" w:semiHidden="1" w:uiPriority="99" w:unhideWhenUsed="1"/>
     <w:lsdException w:name="No Spacing" w:semiHidden="1" w:uiPriority="99" w:unhideWhenUsed="1"/>
     <w:lsdException w:name="Light Shading" w:uiPriority="60"/>
@@ -4294,441 +4538,115 @@
     <w:lsdException w:name="Book Title" w:uiPriority="33" w:qFormat="1"/>
     <w:lsdException w:name="Bibliography" w:semiHidden="1" w:uiPriority="37" w:unhideWhenUsed="1"/>
     <w:lsdException w:name="TOC Heading" w:semiHidden="1" w:uiPriority="39" w:unhideWhenUsed="1" w:qFormat="1"/>
-  </w:latentStyles>
-  <w:style w:type="paragraph" w:default="1" w:styleId="Normal">
-    <w:name w:val="Normal"/>
-    <w:uiPriority w:val="1"/>
-    <w:qFormat/>
-    <w:pPr>
-      <w:widowControl w:val="0"/>
-      <w:autoSpaceDE w:val="0"/>
-      <w:autoSpaceDN w:val="0"/>
-    </w:pPr>
-    <w:rPr>
-      <w:rFonts w:ascii="Times New Roman" w:eastAsia="Times New Roman" w:hAnsi="Times New Roman" w:cs="Times New Roman"/>
-      <w:sz w:val="22"/>
-      <w:szCs w:val="22"/>
-      <w:lang w:val="en-US" w:eastAsia="en-US"/>
-    </w:rPr>
-  </w:style>
-  <w:style w:type="paragraph" w:styleId="Heading1">
-    <w:name w:val="heading 1"/>
-    <w:basedOn w:val="Normal"/>
-    <w:uiPriority w:val="1"/>
-    <w:qFormat/>
-    <w:pPr>
-      <w:ind w:left="165"/>
-      <w:outlineLvl w:val="0"/>
-    </w:pPr>
-    <w:rPr>
-      <w:b/>
-      <w:bCs/>
-      <w:sz w:val="28"/>
-      <w:szCs w:val="28"/>
-    </w:rPr>
-  </w:style>
-  <w:style w:type="paragraph" w:styleId="Heading2">
-    <w:name w:val="heading 2"/>
-    <w:basedOn w:val="Normal"/>
-    <w:uiPriority w:val="1"/>
-    <w:qFormat/>
-    <w:pPr>
-      <w:spacing w:before="182"/>
-      <w:ind w:left="165"/>
-      <w:outlineLvl w:val="1"/>
-    </w:pPr>
-    <w:rPr>
-      <w:b/>
-      <w:bCs/>
-      <w:sz w:val="24"/>
-      <w:szCs w:val="24"/>
-    </w:rPr>
-  </w:style>
-  <w:style w:type="paragraph" w:styleId="Heading3">
-    <w:name w:val="heading 3"/>
-    <w:basedOn w:val="Normal"/>
-    <w:next w:val="Normal"/>
-    <w:link w:val="Heading3Char"/>
-    <w:semiHidden/>
-    <w:unhideWhenUsed/>
-    <w:qFormat/>
-    <w:rsid w:val="00E777E3"/>
-    <w:pPr>
-      <w:keepNext/>
-      <w:keepLines/>
-      <w:spacing w:before="200"/>
-      <w:outlineLvl w:val="2"/>
-    </w:pPr>
-    <w:rPr>
-      <w:rFonts w:asciiTheme="majorHAnsi" w:eastAsiaTheme="majorEastAsia" w:hAnsiTheme="majorHAnsi" w:cstheme="majorBidi"/>
-      <w:b/>
-      <w:bCs/>
-      <w:color w:val="4F81BD" w:themeColor="accent1"/>
-    </w:rPr>
-  </w:style>
-  <w:style w:type="character" w:default="1" w:styleId="DefaultParagraphFont">
-    <w:name w:val="Default Paragraph Font"/>
-    <w:uiPriority w:val="1"/>
-    <w:semiHidden/>
-    <w:unhideWhenUsed/>
-  </w:style>
-  <w:style w:type="table" w:default="1" w:styleId="TableNormal">
-    <w:name w:val="Normal Table"/>
-    <w:uiPriority w:val="99"/>
-    <w:semiHidden/>
-    <w:unhideWhenUsed/>
-    <w:tblPr>
-      <w:tblInd w:w="0" w:type="dxa"/>
-      <w:tblCellMar>
-        <w:top w:w="0" w:type="dxa"/>
-        <w:left w:w="108" w:type="dxa"/>
-        <w:bottom w:w="0" w:type="dxa"/>
-        <w:right w:w="108" w:type="dxa"/>
-      </w:tblCellMar>
-    </w:tblPr>
-  </w:style>
-  <w:style w:type="numbering" w:default="1" w:styleId="NoList">
-    <w:name w:val="No List"/>
-    <w:uiPriority w:val="99"/>
-    <w:semiHidden/>
-    <w:unhideWhenUsed/>
-  </w:style>
-  <w:style w:type="paragraph" w:styleId="BodyText">
-    <w:name w:val="Body Text"/>
-    <w:basedOn w:val="Normal"/>
-    <w:uiPriority w:val="1"/>
-    <w:qFormat/>
-    <w:pPr>
-      <w:ind w:left="165"/>
-    </w:pPr>
-    <w:rPr>
-      <w:sz w:val="24"/>
-      <w:szCs w:val="24"/>
-    </w:rPr>
-  </w:style>
-  <w:style w:type="table" w:customStyle="1" w:styleId="TableNormal1">
-    <w:name w:val="Table Normal1"/>
-    <w:uiPriority w:val="2"/>
-    <w:semiHidden/>
-    <w:unhideWhenUsed/>
-    <w:qFormat/>
-    <w:tblPr>
-      <w:tblCellMar>
-        <w:top w:w="0" w:type="dxa"/>
-        <w:left w:w="0" w:type="dxa"/>
-        <w:bottom w:w="0" w:type="dxa"/>
-        <w:right w:w="0" w:type="dxa"/>
-      </w:tblCellMar>
-    </w:tblPr>
-  </w:style>
-  <w:style w:type="paragraph" w:styleId="ListParagraph">
-    <w:name w:val="List Paragraph"/>
-    <w:basedOn w:val="Normal"/>
-    <w:uiPriority w:val="1"/>
-    <w:qFormat/>
-    <w:pPr>
-      <w:spacing w:before="20"/>
-      <w:ind w:left="884" w:hanging="359"/>
-    </w:pPr>
-  </w:style>
-  <w:style w:type="paragraph" w:customStyle="1" w:styleId="TableParagraph">
-    <w:name w:val="Table Paragraph"/>
-    <w:basedOn w:val="Normal"/>
-    <w:uiPriority w:val="1"/>
-    <w:qFormat/>
-    <w:pPr>
-      <w:spacing w:line="256" w:lineRule="exact"/>
-      <w:ind w:left="106"/>
-    </w:pPr>
-  </w:style>
-  <w:style w:type="character" w:customStyle="1" w:styleId="Heading3Char">
-    <w:name w:val="Heading 3 Char"/>
-    <w:basedOn w:val="DefaultParagraphFont"/>
-    <w:link w:val="Heading3"/>
-    <w:semiHidden/>
-    <w:rsid w:val="00E777E3"/>
-    <w:rPr>
-      <w:rFonts w:asciiTheme="majorHAnsi" w:eastAsiaTheme="majorEastAsia" w:hAnsiTheme="majorHAnsi" w:cstheme="majorBidi"/>
-      <w:b/>
-      <w:bCs/>
-      <w:color w:val="4F81BD" w:themeColor="accent1"/>
-      <w:sz w:val="22"/>
-      <w:szCs w:val="22"/>
-      <w:lang w:val="en-US" w:eastAsia="en-US"/>
-    </w:rPr>
-  </w:style>
-  <w:style w:type="paragraph" w:styleId="NormalWeb">
-    <w:name w:val="Normal (Web)"/>
-    <w:basedOn w:val="Normal"/>
-    <w:uiPriority w:val="99"/>
-    <w:unhideWhenUsed/>
-    <w:rsid w:val="00E777E3"/>
-    <w:pPr>
-      <w:widowControl/>
-      <w:autoSpaceDE/>
-      <w:autoSpaceDN/>
-      <w:spacing w:before="100" w:beforeAutospacing="1" w:after="100" w:afterAutospacing="1"/>
-    </w:pPr>
-    <w:rPr>
-      <w:sz w:val="24"/>
-      <w:szCs w:val="24"/>
-      <w:lang w:val="en-IN" w:eastAsia="en-IN"/>
-    </w:rPr>
-  </w:style>
-  <w:style w:type="paragraph" w:styleId="HTMLPreformatted">
-    <w:name w:val="HTML Preformatted"/>
-    <w:basedOn w:val="Normal"/>
-    <w:link w:val="HTMLPreformattedChar"/>
-    <w:uiPriority w:val="99"/>
-    <w:unhideWhenUsed/>
-    <w:rsid w:val="00E777E3"/>
-    <w:pPr>
-      <w:widowControl/>
-      <w:tabs>
-        <w:tab w:val="left" w:pos="916"/>
-        <w:tab w:val="left" w:pos="1832"/>
-        <w:tab w:val="left" w:pos="2748"/>
-        <w:tab w:val="left" w:pos="3664"/>
-        <w:tab w:val="left" w:pos="4580"/>
-        <w:tab w:val="left" w:pos="5496"/>
-        <w:tab w:val="left" w:pos="6412"/>
-        <w:tab w:val="left" w:pos="7328"/>
-        <w:tab w:val="left" w:pos="8244"/>
-        <w:tab w:val="left" w:pos="9160"/>
-        <w:tab w:val="left" w:pos="10076"/>
-        <w:tab w:val="left" w:pos="10992"/>
-        <w:tab w:val="left" w:pos="11908"/>
-        <w:tab w:val="left" w:pos="12824"/>
-        <w:tab w:val="left" w:pos="13740"/>
-        <w:tab w:val="left" w:pos="14656"/>
-      </w:tabs>
-      <w:autoSpaceDE/>
-      <w:autoSpaceDN/>
-    </w:pPr>
-    <w:rPr>
-      <w:rFonts w:ascii="Courier New" w:hAnsi="Courier New" w:cs="Courier New"/>
-      <w:sz w:val="20"/>
-      <w:szCs w:val="20"/>
-      <w:lang w:val="en-IN" w:eastAsia="en-IN"/>
-    </w:rPr>
-  </w:style>
-  <w:style w:type="character" w:customStyle="1" w:styleId="HTMLPreformattedChar">
-    <w:name w:val="HTML Preformatted Char"/>
-    <w:basedOn w:val="DefaultParagraphFont"/>
-    <w:link w:val="HTMLPreformatted"/>
-    <w:uiPriority w:val="99"/>
-    <w:rsid w:val="00E777E3"/>
-    <w:rPr>
-      <w:rFonts w:ascii="Courier New" w:eastAsia="Times New Roman" w:hAnsi="Courier New" w:cs="Courier New"/>
-    </w:rPr>
-  </w:style>
-  <w:style w:type="character" w:styleId="HTMLCode">
-    <w:name w:val="HTML Code"/>
-    <w:basedOn w:val="DefaultParagraphFont"/>
-    <w:uiPriority w:val="99"/>
-    <w:unhideWhenUsed/>
-    <w:rsid w:val="00E777E3"/>
-    <w:rPr>
-      <w:rFonts w:ascii="Courier New" w:eastAsia="Times New Roman" w:hAnsi="Courier New" w:cs="Courier New"/>
-      <w:sz w:val="20"/>
-      <w:szCs w:val="20"/>
-    </w:rPr>
-  </w:style>
-  <w:style w:type="table" w:styleId="TableGrid">
-    <w:name w:val="Table Grid"/>
-    <w:basedOn w:val="TableNormal"/>
-    <w:rsid w:val="00EF4428"/>
-    <w:tblPr>
-      <w:tblBorders>
-        <w:top w:val="single" w:sz="4" w:space="0" w:color="auto"/>
-        <w:left w:val="single" w:sz="4" w:space="0" w:color="auto"/>
-        <w:bottom w:val="single" w:sz="4" w:space="0" w:color="auto"/>
-        <w:right w:val="single" w:sz="4" w:space="0" w:color="auto"/>
-        <w:insideH w:val="single" w:sz="4" w:space="0" w:color="auto"/>
-        <w:insideV w:val="single" w:sz="4" w:space="0" w:color="auto"/>
-      </w:tblBorders>
-    </w:tblPr>
-  </w:style>
-  <w:style w:type="paragraph" w:customStyle="1" w:styleId="pdq2pgselectionanchorcontainer">
-    <w:name w:val="pdq2pg_selectionanchorcontainer"/>
-    <w:basedOn w:val="Normal"/>
-    <w:rsid w:val="007D7DC8"/>
-    <w:pPr>
-      <w:widowControl/>
-      <w:autoSpaceDE/>
-      <w:autoSpaceDN/>
-      <w:spacing w:before="100" w:beforeAutospacing="1" w:after="100" w:afterAutospacing="1"/>
-    </w:pPr>
-    <w:rPr>
-      <w:sz w:val="24"/>
-      <w:szCs w:val="24"/>
-      <w:lang w:val="en-IN" w:eastAsia="en-IN"/>
-    </w:rPr>
-  </w:style>
-  <w:style w:type="character" w:styleId="Strong">
-    <w:name w:val="Strong"/>
-    <w:basedOn w:val="DefaultParagraphFont"/>
-    <w:uiPriority w:val="22"/>
-    <w:qFormat/>
-    <w:rsid w:val="00506EE0"/>
-    <w:rPr>
-      <w:b/>
-      <w:bCs/>
-    </w:rPr>
-  </w:style>
-</w:styles>
-</file>
-
-<file path=word/stylesWithEffects.xml><?xml version="1.0" encoding="utf-8"?>
-<w:styles xmlns:wpc="http://schemas.microsoft.com/office/word/2010/wordprocessingCanvas" xmlns:mc="http://schemas.openxmlformats.org/markup-compatibility/2006" xmlns:o="urn:schemas-microsoft-com:office:office" xmlns:r="http://schemas.openxmlformats.org/officeDocument/2006/relationships" xmlns:m="http://schemas.openxmlformats.org/officeDocument/2006/math" xmlns:v="urn:schemas-microsoft-com:vml" xmlns:wp14="http://schemas.microsoft.com/office/word/2010/wordprocessingDrawing" xmlns:wp="http://schemas.openxmlformats.org/drawingml/2006/wordprocessingDrawing" xmlns:w10="urn:schemas-microsoft-com:office:word" xmlns:w="http://schemas.openxmlformats.org/wordprocessingml/2006/main" xmlns:w14="http://schemas.microsoft.com/office/word/2010/wordml" xmlns:wpg="http://schemas.microsoft.com/office/word/2010/wordprocessingGroup" xmlns:wpi="http://schemas.microsoft.com/office/word/2010/wordprocessingInk" xmlns:wne="http://schemas.microsoft.com/office/word/2006/wordml" xmlns:wps="http://schemas.microsoft.com/office/word/2010/wordprocessingShape" mc:Ignorable="w14 wp14">
-  <w:docDefaults>
-    <w:rPrDefault>
-      <w:rPr>
-        <w:rFonts w:asciiTheme="minorHAnsi" w:eastAsiaTheme="minorHAnsi" w:hAnsiTheme="minorHAnsi" w:cstheme="minorBidi"/>
-        <w:lang w:val="en-IN" w:eastAsia="en-IN" w:bidi="ar-SA"/>
-      </w:rPr>
-    </w:rPrDefault>
-    <w:pPrDefault/>
-  </w:docDefaults>
-  <w:latentStyles w:defLockedState="0" w:defUIPriority="0" w:defSemiHidden="0" w:defUnhideWhenUsed="0" w:defQFormat="0" w:count="267">
-    <w:lsdException w:name="Normal" w:uiPriority="1" w:qFormat="1"/>
-    <w:lsdException w:name="heading 1" w:uiPriority="1" w:qFormat="1"/>
-    <w:lsdException w:name="heading 2" w:uiPriority="1" w:qFormat="1"/>
-    <w:lsdException w:name="heading 3" w:semiHidden="1" w:unhideWhenUsed="1" w:qFormat="1"/>
-    <w:lsdException w:name="heading 4" w:semiHidden="1" w:unhideWhenUsed="1" w:qFormat="1"/>
-    <w:lsdException w:name="heading 5" w:semiHidden="1" w:unhideWhenUsed="1" w:qFormat="1"/>
-    <w:lsdException w:name="heading 6" w:semiHidden="1" w:unhideWhenUsed="1" w:qFormat="1"/>
-    <w:lsdException w:name="heading 7" w:semiHidden="1" w:unhideWhenUsed="1" w:qFormat="1"/>
-    <w:lsdException w:name="heading 8" w:semiHidden="1" w:unhideWhenUsed="1" w:qFormat="1"/>
-    <w:lsdException w:name="heading 9" w:semiHidden="1" w:unhideWhenUsed="1" w:qFormat="1"/>
-    <w:lsdException w:name="caption" w:semiHidden="1" w:unhideWhenUsed="1" w:qFormat="1"/>
-    <w:lsdException w:name="Title" w:qFormat="1"/>
-    <w:lsdException w:name="Default Paragraph Font" w:semiHidden="1" w:uiPriority="1" w:unhideWhenUsed="1"/>
-    <w:lsdException w:name="Body Text" w:uiPriority="1" w:qFormat="1"/>
-    <w:lsdException w:name="Subtitle" w:qFormat="1"/>
-    <w:lsdException w:name="Strong" w:uiPriority="22" w:qFormat="1"/>
-    <w:lsdException w:name="Emphasis" w:qFormat="1"/>
-    <w:lsdException w:name="HTML Top of Form" w:semiHidden="1" w:uiPriority="99" w:unhideWhenUsed="1"/>
-    <w:lsdException w:name="HTML Bottom of Form" w:semiHidden="1" w:uiPriority="99" w:unhideWhenUsed="1"/>
-    <w:lsdException w:name="Normal (Web)" w:uiPriority="99"/>
-    <w:lsdException w:name="HTML Code" w:uiPriority="99"/>
-    <w:lsdException w:name="HTML Preformatted" w:uiPriority="99"/>
-    <w:lsdException w:name="Normal Table" w:semiHidden="1"/>
-    <w:lsdException w:name="No List" w:semiHidden="1" w:uiPriority="99" w:unhideWhenUsed="1"/>
-    <w:lsdException w:name="Outline List 1" w:semiHidden="1" w:uiPriority="99" w:unhideWhenUsed="1"/>
-    <w:lsdException w:name="Outline List 2" w:semiHidden="1" w:uiPriority="99" w:unhideWhenUsed="1"/>
-    <w:lsdException w:name="Outline List 3" w:semiHidden="1" w:uiPriority="99" w:unhideWhenUsed="1"/>
-    <w:lsdException w:name="Placeholder Text" w:semiHidden="1" w:uiPriority="99" w:unhideWhenUsed="1"/>
-    <w:lsdException w:name="No Spacing" w:semiHidden="1" w:uiPriority="99" w:unhideWhenUsed="1"/>
-    <w:lsdException w:name="Light Shading" w:uiPriority="60"/>
-    <w:lsdException w:name="Light List" w:uiPriority="61"/>
-    <w:lsdException w:name="Light Grid" w:uiPriority="62"/>
-    <w:lsdException w:name="Medium Shading 1" w:uiPriority="63"/>
-    <w:lsdException w:name="Medium Shading 2" w:uiPriority="64"/>
-    <w:lsdException w:name="Medium List 1" w:uiPriority="65"/>
-    <w:lsdException w:name="Medium List 2" w:uiPriority="66"/>
-    <w:lsdException w:name="Medium Grid 1" w:uiPriority="67"/>
-    <w:lsdException w:name="Medium Grid 2" w:uiPriority="68"/>
-    <w:lsdException w:name="Medium Grid 3" w:uiPriority="69"/>
-    <w:lsdException w:name="Dark List" w:uiPriority="70"/>
-    <w:lsdException w:name="Colorful Shading" w:uiPriority="71"/>
-    <w:lsdException w:name="Colorful List" w:uiPriority="72"/>
-    <w:lsdException w:name="Colorful Grid" w:uiPriority="73"/>
-    <w:lsdException w:name="Light Shading Accent 1" w:uiPriority="60"/>
-    <w:lsdException w:name="Light List Accent 1" w:uiPriority="61"/>
-    <w:lsdException w:name="Light Grid Accent 1" w:uiPriority="62"/>
-    <w:lsdException w:name="Medium Shading 1 Accent 1" w:uiPriority="63"/>
-    <w:lsdException w:name="Medium Shading 2 Accent 1" w:uiPriority="64"/>
-    <w:lsdException w:name="Medium List 1 Accent 1" w:uiPriority="65"/>
-    <w:lsdException w:name="Revision" w:semiHidden="1" w:uiPriority="99" w:unhideWhenUsed="1"/>
-    <w:lsdException w:name="List Paragraph" w:uiPriority="1" w:qFormat="1"/>
-    <w:lsdException w:name="Quote" w:semiHidden="1" w:uiPriority="99" w:unhideWhenUsed="1"/>
-    <w:lsdException w:name="Intense Quote" w:semiHidden="1" w:uiPriority="99" w:unhideWhenUsed="1"/>
-    <w:lsdException w:name="Medium List 2 Accent 1" w:uiPriority="66"/>
-    <w:lsdException w:name="Medium Grid 1 Accent 1" w:uiPriority="67"/>
-    <w:lsdException w:name="Medium Grid 2 Accent 1" w:uiPriority="68"/>
-    <w:lsdException w:name="Medium Grid 3 Accent 1" w:uiPriority="69"/>
-    <w:lsdException w:name="Dark List Accent 1" w:uiPriority="70"/>
-    <w:lsdException w:name="Colorful Shading Accent 1" w:uiPriority="71"/>
-    <w:lsdException w:name="Colorful List Accent 1" w:uiPriority="72"/>
-    <w:lsdException w:name="Colorful Grid Accent 1" w:uiPriority="73"/>
-    <w:lsdException w:name="Light Shading Accent 2" w:uiPriority="60"/>
-    <w:lsdException w:name="Light List Accent 2" w:uiPriority="61"/>
-    <w:lsdException w:name="Light Grid Accent 2" w:uiPriority="62"/>
-    <w:lsdException w:name="Medium Shading 1 Accent 2" w:uiPriority="63"/>
-    <w:lsdException w:name="Medium Shading 2 Accent 2" w:uiPriority="64"/>
-    <w:lsdException w:name="Medium List 1 Accent 2" w:uiPriority="65"/>
-    <w:lsdException w:name="Medium List 2 Accent 2" w:uiPriority="66"/>
-    <w:lsdException w:name="Medium Grid 1 Accent 2" w:uiPriority="67"/>
-    <w:lsdException w:name="Medium Grid 2 Accent 2" w:uiPriority="68"/>
-    <w:lsdException w:name="Medium Grid 3 Accent 2" w:uiPriority="69"/>
-    <w:lsdException w:name="Dark List Accent 2" w:uiPriority="70"/>
-    <w:lsdException w:name="Colorful Shading Accent 2" w:uiPriority="71"/>
-    <w:lsdException w:name="Colorful List Accent 2" w:uiPriority="72"/>
-    <w:lsdException w:name="Colorful Grid Accent 2" w:uiPriority="73"/>
-    <w:lsdException w:name="Light Shading Accent 3" w:uiPriority="60"/>
-    <w:lsdException w:name="Light List Accent 3" w:uiPriority="61"/>
-    <w:lsdException w:name="Light Grid Accent 3" w:uiPriority="62"/>
-    <w:lsdException w:name="Medium Shading 1 Accent 3" w:uiPriority="63"/>
-    <w:lsdException w:name="Medium Shading 2 Accent 3" w:uiPriority="64"/>
-    <w:lsdException w:name="Medium List 1 Accent 3" w:uiPriority="65"/>
-    <w:lsdException w:name="Medium List 2 Accent 3" w:uiPriority="66"/>
-    <w:lsdException w:name="Medium Grid 1 Accent 3" w:uiPriority="67"/>
-    <w:lsdException w:name="Medium Grid 2 Accent 3" w:uiPriority="68"/>
-    <w:lsdException w:name="Medium Grid 3 Accent 3" w:uiPriority="69"/>
-    <w:lsdException w:name="Dark List Accent 3" w:uiPriority="70"/>
-    <w:lsdException w:name="Colorful Shading Accent 3" w:uiPriority="71"/>
-    <w:lsdException w:name="Colorful List Accent 3" w:uiPriority="72"/>
-    <w:lsdException w:name="Colorful Grid Accent 3" w:uiPriority="73"/>
-    <w:lsdException w:name="Light Shading Accent 4" w:uiPriority="60"/>
-    <w:lsdException w:name="Light List Accent 4" w:uiPriority="61"/>
-    <w:lsdException w:name="Light Grid Accent 4" w:uiPriority="62"/>
-    <w:lsdException w:name="Medium Shading 1 Accent 4" w:uiPriority="63"/>
-    <w:lsdException w:name="Medium Shading 2 Accent 4" w:uiPriority="64"/>
-    <w:lsdException w:name="Medium List 1 Accent 4" w:uiPriority="65"/>
-    <w:lsdException w:name="Medium List 2 Accent 4" w:uiPriority="66"/>
-    <w:lsdException w:name="Medium Grid 1 Accent 4" w:uiPriority="67"/>
-    <w:lsdException w:name="Medium Grid 2 Accent 4" w:uiPriority="68"/>
-    <w:lsdException w:name="Medium Grid 3 Accent 4" w:uiPriority="69"/>
-    <w:lsdException w:name="Dark List Accent 4" w:uiPriority="70"/>
-    <w:lsdException w:name="Colorful Shading Accent 4" w:uiPriority="71"/>
-    <w:lsdException w:name="Colorful List Accent 4" w:uiPriority="72"/>
-    <w:lsdException w:name="Colorful Grid Accent 4" w:uiPriority="73"/>
-    <w:lsdException w:name="Light Shading Accent 5" w:uiPriority="60"/>
-    <w:lsdException w:name="Light List Accent 5" w:uiPriority="61"/>
-    <w:lsdException w:name="Light Grid Accent 5" w:uiPriority="62"/>
-    <w:lsdException w:name="Medium Shading 1 Accent 5" w:uiPriority="63"/>
-    <w:lsdException w:name="Medium Shading 2 Accent 5" w:uiPriority="64"/>
-    <w:lsdException w:name="Medium List 1 Accent 5" w:uiPriority="65"/>
-    <w:lsdException w:name="Medium List 2 Accent 5" w:uiPriority="66"/>
-    <w:lsdException w:name="Medium Grid 1 Accent 5" w:uiPriority="67"/>
-    <w:lsdException w:name="Medium Grid 2 Accent 5" w:uiPriority="68"/>
-    <w:lsdException w:name="Medium Grid 3 Accent 5" w:uiPriority="69"/>
-    <w:lsdException w:name="Dark List Accent 5" w:uiPriority="70"/>
-    <w:lsdException w:name="Colorful Shading Accent 5" w:uiPriority="71"/>
-    <w:lsdException w:name="Colorful List Accent 5" w:uiPriority="72"/>
-    <w:lsdException w:name="Colorful Grid Accent 5" w:uiPriority="73"/>
-    <w:lsdException w:name="Light Shading Accent 6" w:uiPriority="60"/>
-    <w:lsdException w:name="Light List Accent 6" w:uiPriority="61"/>
-    <w:lsdException w:name="Light Grid Accent 6" w:uiPriority="62"/>
-    <w:lsdException w:name="Medium Shading 1 Accent 6" w:uiPriority="63"/>
-    <w:lsdException w:name="Medium Shading 2 Accent 6" w:uiPriority="64"/>
-    <w:lsdException w:name="Medium List 1 Accent 6" w:uiPriority="65"/>
-    <w:lsdException w:name="Medium List 2 Accent 6" w:uiPriority="66"/>
-    <w:lsdException w:name="Medium Grid 1 Accent 6" w:uiPriority="67"/>
-    <w:lsdException w:name="Medium Grid 2 Accent 6" w:uiPriority="68"/>
-    <w:lsdException w:name="Medium Grid 3 Accent 6" w:uiPriority="69"/>
-    <w:lsdException w:name="Dark List Accent 6" w:uiPriority="70"/>
-    <w:lsdException w:name="Colorful Shading Accent 6" w:uiPriority="71"/>
-    <w:lsdException w:name="Colorful List Accent 6" w:uiPriority="72"/>
-    <w:lsdException w:name="Colorful Grid Accent 6" w:uiPriority="73"/>
-    <w:lsdException w:name="Subtle Emphasis" w:uiPriority="19" w:qFormat="1"/>
-    <w:lsdException w:name="Intense Emphasis" w:uiPriority="21" w:qFormat="1"/>
-    <w:lsdException w:name="Subtle Reference" w:uiPriority="31" w:qFormat="1"/>
-    <w:lsdException w:name="Intense Reference" w:uiPriority="32" w:qFormat="1"/>
-    <w:lsdException w:name="Book Title" w:uiPriority="33" w:qFormat="1"/>
-    <w:lsdException w:name="Bibliography" w:semiHidden="1" w:uiPriority="37" w:unhideWhenUsed="1"/>
-    <w:lsdException w:name="TOC Heading" w:semiHidden="1" w:uiPriority="39" w:unhideWhenUsed="1" w:qFormat="1"/>
+    <w:lsdException w:name="Plain Table 1" w:uiPriority="41"/>
+    <w:lsdException w:name="Plain Table 2" w:uiPriority="42"/>
+    <w:lsdException w:name="Plain Table 3" w:uiPriority="43"/>
+    <w:lsdException w:name="Plain Table 4" w:uiPriority="44"/>
+    <w:lsdException w:name="Plain Table 5" w:uiPriority="45"/>
+    <w:lsdException w:name="Grid Table Light" w:uiPriority="40"/>
+    <w:lsdException w:name="Grid Table 1 Light" w:uiPriority="46"/>
+    <w:lsdException w:name="Grid Table 2" w:uiPriority="47"/>
+    <w:lsdException w:name="Grid Table 3" w:uiPriority="48"/>
+    <w:lsdException w:name="Grid Table 4" w:uiPriority="49"/>
+    <w:lsdException w:name="Grid Table 5 Dark" w:uiPriority="50"/>
+    <w:lsdException w:name="Grid Table 6 Colorful" w:uiPriority="51"/>
+    <w:lsdException w:name="Grid Table 7 Colorful" w:uiPriority="52"/>
+    <w:lsdException w:name="Grid Table 1 Light Accent 1" w:uiPriority="46"/>
+    <w:lsdException w:name="Grid Table 2 Accent 1" w:uiPriority="47"/>
+    <w:lsdException w:name="Grid Table 3 Accent 1" w:uiPriority="48"/>
+    <w:lsdException w:name="Grid Table 4 Accent 1" w:uiPriority="49"/>
+    <w:lsdException w:name="Grid Table 5 Dark Accent 1" w:uiPriority="50"/>
+    <w:lsdException w:name="Grid Table 6 Colorful Accent 1" w:uiPriority="51"/>
+    <w:lsdException w:name="Grid Table 7 Colorful Accent 1" w:uiPriority="52"/>
+    <w:lsdException w:name="Grid Table 1 Light Accent 2" w:uiPriority="46"/>
+    <w:lsdException w:name="Grid Table 2 Accent 2" w:uiPriority="47"/>
+    <w:lsdException w:name="Grid Table 3 Accent 2" w:uiPriority="48"/>
+    <w:lsdException w:name="Grid Table 4 Accent 2" w:uiPriority="49"/>
+    <w:lsdException w:name="Grid Table 5 Dark Accent 2" w:uiPriority="50"/>
+    <w:lsdException w:name="Grid Table 6 Colorful Accent 2" w:uiPriority="51"/>
+    <w:lsdException w:name="Grid Table 7 Colorful Accent 2" w:uiPriority="52"/>
+    <w:lsdException w:name="Grid Table 1 Light Accent 3" w:uiPriority="46"/>
+    <w:lsdException w:name="Grid Table 2 Accent 3" w:uiPriority="47"/>
+    <w:lsdException w:name="Grid Table 3 Accent 3" w:uiPriority="48"/>
+    <w:lsdException w:name="Grid Table 4 Accent 3" w:uiPriority="49"/>
+    <w:lsdException w:name="Grid Table 5 Dark Accent 3" w:uiPriority="50"/>
+    <w:lsdException w:name="Grid Table 6 Colorful Accent 3" w:uiPriority="51"/>
+    <w:lsdException w:name="Grid Table 7 Colorful Accent 3" w:uiPriority="52"/>
+    <w:lsdException w:name="Grid Table 1 Light Accent 4" w:uiPriority="46"/>
+    <w:lsdException w:name="Grid Table 2 Accent 4" w:uiPriority="47"/>
+    <w:lsdException w:name="Grid Table 3 Accent 4" w:uiPriority="48"/>
+    <w:lsdException w:name="Grid Table 4 Accent 4" w:uiPriority="49"/>
+    <w:lsdException w:name="Grid Table 5 Dark Accent 4" w:uiPriority="50"/>
+    <w:lsdException w:name="Grid Table 6 Colorful Accent 4" w:uiPriority="51"/>
+    <w:lsdException w:name="Grid Table 7 Colorful Accent 4" w:uiPriority="52"/>
+    <w:lsdException w:name="Grid Table 1 Light Accent 5" w:uiPriority="46"/>
+    <w:lsdException w:name="Grid Table 2 Accent 5" w:uiPriority="47"/>
+    <w:lsdException w:name="Grid Table 3 Accent 5" w:uiPriority="48"/>
+    <w:lsdException w:name="Grid Table 4 Accent 5" w:uiPriority="49"/>
+    <w:lsdException w:name="Grid Table 5 Dark Accent 5" w:uiPriority="50"/>
+    <w:lsdException w:name="Grid Table 6 Colorful Accent 5" w:uiPriority="51"/>
+    <w:lsdException w:name="Grid Table 7 Colorful Accent 5" w:uiPriority="52"/>
+    <w:lsdException w:name="Grid Table 1 Light Accent 6" w:uiPriority="46"/>
+    <w:lsdException w:name="Grid Table 2 Accent 6" w:uiPriority="47"/>
+    <w:lsdException w:name="Grid Table 3 Accent 6" w:uiPriority="48"/>
+    <w:lsdException w:name="Grid Table 4 Accent 6" w:uiPriority="49"/>
+    <w:lsdException w:name="Grid Table 5 Dark Accent 6" w:uiPriority="50"/>
+    <w:lsdException w:name="Grid Table 6 Colorful Accent 6" w:uiPriority="51"/>
+    <w:lsdException w:name="Grid Table 7 Colorful Accent 6" w:uiPriority="52"/>
+    <w:lsdException w:name="List Table 1 Light" w:uiPriority="46"/>
+    <w:lsdException w:name="List Table 2" w:uiPriority="47"/>
+    <w:lsdException w:name="List Table 3" w:uiPriority="48"/>
+    <w:lsdException w:name="List Table 4" w:uiPriority="49"/>
+    <w:lsdException w:name="List Table 5 Dark" w:uiPriority="50"/>
+    <w:lsdException w:name="List Table 6 Colorful" w:uiPriority="51"/>
+    <w:lsdException w:name="List Table 7 Colorful" w:uiPriority="52"/>
+    <w:lsdException w:name="List Table 1 Light Accent 1" w:uiPriority="46"/>
+    <w:lsdException w:name="List Table 2 Accent 1" w:uiPriority="47"/>
+    <w:lsdException w:name="List Table 3 Accent 1" w:uiPriority="48"/>
+    <w:lsdException w:name="List Table 4 Accent 1" w:uiPriority="49"/>
+    <w:lsdException w:name="List Table 5 Dark Accent 1" w:uiPriority="50"/>
+    <w:lsdException w:name="List Table 6 Colorful Accent 1" w:uiPriority="51"/>
+    <w:lsdException w:name="List Table 7 Colorful Accent 1" w:uiPriority="52"/>
+    <w:lsdException w:name="List Table 1 Light Accent 2" w:uiPriority="46"/>
+    <w:lsdException w:name="List Table 2 Accent 2" w:uiPriority="47"/>
+    <w:lsdException w:name="List Table 3 Accent 2" w:uiPriority="48"/>
+    <w:lsdException w:name="List Table 4 Accent 2" w:uiPriority="49"/>
+    <w:lsdException w:name="List Table 5 Dark Accent 2" w:uiPriority="50"/>
+    <w:lsdException w:name="List Table 6 Colorful Accent 2" w:uiPriority="51"/>
+    <w:lsdException w:name="List Table 7 Colorful Accent 2" w:uiPriority="52"/>
+    <w:lsdException w:name="List Table 1 Light Accent 3" w:uiPriority="46"/>
+    <w:lsdException w:name="List Table 2 Accent 3" w:uiPriority="47"/>
+    <w:lsdException w:name="List Table 3 Accent 3" w:uiPriority="48"/>
+    <w:lsdException w:name="List Table 4 Accent 3" w:uiPriority="49"/>
+    <w:lsdException w:name="List Table 5 Dark Accent 3" w:uiPriority="50"/>
+    <w:lsdException w:name="List Table 6 Colorful Accent 3" w:uiPriority="51"/>
+    <w:lsdException w:name="List Table 7 Colorful Accent 3" w:uiPriority="52"/>
+    <w:lsdException w:name="List Table 1 Light Accent 4" w:uiPriority="46"/>
+    <w:lsdException w:name="List Table 2 Accent 4" w:uiPriority="47"/>
+    <w:lsdException w:name="List Table 3 Accent 4" w:uiPriority="48"/>
+    <w:lsdException w:name="List Table 4 Accent 4" w:uiPriority="49"/>
+    <w:lsdException w:name="List Table 5 Dark Accent 4" w:uiPriority="50"/>
+    <w:lsdException w:name="List Table 6 Colorful Accent 4" w:uiPriority="51"/>
+    <w:lsdException w:name="List Table 7 Colorful Accent 4" w:uiPriority="52"/>
+    <w:lsdException w:name="List Table 1 Light Accent 5" w:uiPriority="46"/>
+    <w:lsdException w:name="List Table 2 Accent 5" w:uiPriority="47"/>
+    <w:lsdException w:name="List Table 3 Accent 5" w:uiPriority="48"/>
+    <w:lsdException w:name="List Table 4 Accent 5" w:uiPriority="49"/>
+    <w:lsdException w:name="List Table 5 Dark Accent 5" w:uiPriority="50"/>
+    <w:lsdException w:name="List Table 6 Colorful Accent 5" w:uiPriority="51"/>
+    <w:lsdException w:name="List Table 7 Colorful Accent 5" w:uiPriority="52"/>
+    <w:lsdException w:name="List Table 1 Light Accent 6" w:uiPriority="46"/>
+    <w:lsdException w:name="List Table 2 Accent 6" w:uiPriority="47"/>
+    <w:lsdException w:name="List Table 3 Accent 6" w:uiPriority="48"/>
+    <w:lsdException w:name="List Table 4 Accent 6" w:uiPriority="49"/>
+    <w:lsdException w:name="List Table 5 Dark Accent 6" w:uiPriority="50"/>
+    <w:lsdException w:name="List Table 6 Colorful Accent 6" w:uiPriority="51"/>
+    <w:lsdException w:name="List Table 7 Colorful Accent 6" w:uiPriority="52"/>
+    <w:lsdException w:name="Mention" w:semiHidden="1" w:uiPriority="99" w:unhideWhenUsed="1"/>
+    <w:lsdException w:name="Smart Hyperlink" w:semiHidden="1" w:uiPriority="99" w:unhideWhenUsed="1"/>
+    <w:lsdException w:name="Hashtag" w:semiHidden="1" w:uiPriority="99" w:unhideWhenUsed="1"/>
+    <w:lsdException w:name="Unresolved Mention" w:semiHidden="1" w:uiPriority="99" w:unhideWhenUsed="1"/>
+    <w:lsdException w:name="Smart Link" w:semiHidden="1" w:uiPriority="99" w:unhideWhenUsed="1"/>
   </w:latentStyles>
   <w:style w:type="paragraph" w:default="1" w:styleId="Normal">
     <w:name w:val="Normal"/>

</xml_diff>